<commit_message>
index page + css + links
</commit_message>
<xml_diff>
--- a/Ερωτηματολόγιο.docx
+++ b/Ερωτηματολόγιο.docx
@@ -19,6 +19,338 @@
     </w:p>
     <w:p>
       <w:pPr>
+        <w:pStyle w:val="NormalWeb"/>
+        <w:numPr>
+          <w:ilvl w:val="0"/>
+          <w:numId w:val="20"/>
+        </w:numPr>
+        <w:rPr>
+          <w:rFonts w:asciiTheme="minorHAnsi" w:eastAsiaTheme="minorHAnsi" w:hAnsiTheme="minorHAnsi" w:cstheme="minorBidi"/>
+          <w:kern w:val="2"/>
+          <w:sz w:val="22"/>
+          <w:szCs w:val="22"/>
+          <w:lang w:val="el-GR" w:eastAsia="en-US"/>
+          <w14:ligatures w14:val="standardContextual"/>
+        </w:rPr>
+      </w:pPr>
+      <w:proofErr w:type="spellStart"/>
+      <w:r>
+        <w:rPr>
+          <w:rFonts w:asciiTheme="minorHAnsi" w:eastAsiaTheme="minorHAnsi" w:hAnsiTheme="minorHAnsi" w:cstheme="minorBidi"/>
+          <w:kern w:val="2"/>
+          <w:sz w:val="22"/>
+          <w:szCs w:val="22"/>
+          <w:lang w:val="el-GR" w:eastAsia="en-US"/>
+          <w14:ligatures w14:val="standardContextual"/>
+        </w:rPr>
+        <w:t>Κάτω</w:t>
+      </w:r>
+      <w:proofErr w:type="spellEnd"/>
+      <w:r>
+        <w:rPr>
+          <w:rFonts w:asciiTheme="minorHAnsi" w:eastAsiaTheme="minorHAnsi" w:hAnsiTheme="minorHAnsi" w:cstheme="minorBidi"/>
+          <w:kern w:val="2"/>
+          <w:sz w:val="22"/>
+          <w:szCs w:val="22"/>
+          <w:lang w:val="el-GR" w:eastAsia="en-US"/>
+          <w14:ligatures w14:val="standardContextual"/>
+        </w:rPr>
+        <w:t xml:space="preserve"> </w:t>
+      </w:r>
+      <w:proofErr w:type="spellStart"/>
+      <w:r>
+        <w:rPr>
+          <w:rFonts w:asciiTheme="minorHAnsi" w:eastAsiaTheme="minorHAnsi" w:hAnsiTheme="minorHAnsi" w:cstheme="minorBidi"/>
+          <w:kern w:val="2"/>
+          <w:sz w:val="22"/>
+          <w:szCs w:val="22"/>
+          <w:lang w:val="el-GR" w:eastAsia="en-US"/>
+          <w14:ligatures w14:val="standardContextual"/>
+        </w:rPr>
+        <w:t>των</w:t>
+      </w:r>
+      <w:proofErr w:type="spellEnd"/>
+      <w:r>
+        <w:rPr>
+          <w:rFonts w:asciiTheme="minorHAnsi" w:eastAsiaTheme="minorHAnsi" w:hAnsiTheme="minorHAnsi" w:cstheme="minorBidi"/>
+          <w:kern w:val="2"/>
+          <w:sz w:val="22"/>
+          <w:szCs w:val="22"/>
+          <w:lang w:val="el-GR" w:eastAsia="en-US"/>
+          <w14:ligatures w14:val="standardContextual"/>
+        </w:rPr>
+        <w:t xml:space="preserve"> 18</w:t>
+      </w:r>
+    </w:p>
+    <w:p>
+      <w:pPr>
+        <w:pStyle w:val="NormalWeb"/>
+        <w:numPr>
+          <w:ilvl w:val="0"/>
+          <w:numId w:val="20"/>
+        </w:numPr>
+        <w:rPr>
+          <w:rFonts w:asciiTheme="minorHAnsi" w:eastAsiaTheme="minorHAnsi" w:hAnsiTheme="minorHAnsi" w:cstheme="minorBidi"/>
+          <w:kern w:val="2"/>
+          <w:sz w:val="22"/>
+          <w:szCs w:val="22"/>
+          <w:lang w:val="el-GR" w:eastAsia="en-US"/>
+          <w14:ligatures w14:val="standardContextual"/>
+        </w:rPr>
+      </w:pPr>
+      <w:r>
+        <w:rPr>
+          <w:rFonts w:asciiTheme="minorHAnsi" w:eastAsiaTheme="minorHAnsi" w:hAnsiTheme="minorHAnsi" w:cstheme="minorBidi"/>
+          <w:kern w:val="2"/>
+          <w:sz w:val="22"/>
+          <w:szCs w:val="22"/>
+          <w:lang w:val="el-GR" w:eastAsia="en-US"/>
+          <w14:ligatures w14:val="standardContextual"/>
+        </w:rPr>
+        <w:t>18–24</w:t>
+      </w:r>
+    </w:p>
+    <w:p>
+      <w:pPr>
+        <w:pStyle w:val="NormalWeb"/>
+        <w:numPr>
+          <w:ilvl w:val="0"/>
+          <w:numId w:val="20"/>
+        </w:numPr>
+        <w:rPr>
+          <w:rFonts w:asciiTheme="minorHAnsi" w:eastAsiaTheme="minorHAnsi" w:hAnsiTheme="minorHAnsi" w:cstheme="minorBidi"/>
+          <w:kern w:val="2"/>
+          <w:sz w:val="22"/>
+          <w:szCs w:val="22"/>
+          <w:lang w:val="el-GR" w:eastAsia="en-US"/>
+          <w14:ligatures w14:val="standardContextual"/>
+        </w:rPr>
+      </w:pPr>
+      <w:r>
+        <w:rPr>
+          <w:rFonts w:asciiTheme="minorHAnsi" w:eastAsiaTheme="minorHAnsi" w:hAnsiTheme="minorHAnsi" w:cstheme="minorBidi"/>
+          <w:kern w:val="2"/>
+          <w:sz w:val="22"/>
+          <w:szCs w:val="22"/>
+          <w:lang w:val="el-GR" w:eastAsia="en-US"/>
+          <w14:ligatures w14:val="standardContextual"/>
+        </w:rPr>
+        <w:t>25–34</w:t>
+      </w:r>
+    </w:p>
+    <w:p>
+      <w:pPr>
+        <w:pStyle w:val="NormalWeb"/>
+        <w:numPr>
+          <w:ilvl w:val="0"/>
+          <w:numId w:val="20"/>
+        </w:numPr>
+        <w:rPr>
+          <w:rFonts w:asciiTheme="minorHAnsi" w:eastAsiaTheme="minorHAnsi" w:hAnsiTheme="minorHAnsi" w:cstheme="minorBidi"/>
+          <w:kern w:val="2"/>
+          <w:sz w:val="22"/>
+          <w:szCs w:val="22"/>
+          <w:lang w:val="el-GR" w:eastAsia="en-US"/>
+          <w14:ligatures w14:val="standardContextual"/>
+        </w:rPr>
+      </w:pPr>
+      <w:r>
+        <w:rPr>
+          <w:rFonts w:asciiTheme="minorHAnsi" w:eastAsiaTheme="minorHAnsi" w:hAnsiTheme="minorHAnsi" w:cstheme="minorBidi"/>
+          <w:kern w:val="2"/>
+          <w:sz w:val="22"/>
+          <w:szCs w:val="22"/>
+          <w:lang w:val="el-GR" w:eastAsia="en-US"/>
+          <w14:ligatures w14:val="standardContextual"/>
+        </w:rPr>
+        <w:t>35–44</w:t>
+      </w:r>
+    </w:p>
+    <w:p>
+      <w:pPr>
+        <w:pStyle w:val="NormalWeb"/>
+        <w:numPr>
+          <w:ilvl w:val="0"/>
+          <w:numId w:val="20"/>
+        </w:numPr>
+        <w:rPr>
+          <w:rFonts w:asciiTheme="minorHAnsi" w:eastAsiaTheme="minorHAnsi" w:hAnsiTheme="minorHAnsi" w:cstheme="minorBidi"/>
+          <w:kern w:val="2"/>
+          <w:sz w:val="22"/>
+          <w:szCs w:val="22"/>
+          <w:lang w:val="el-GR" w:eastAsia="en-US"/>
+          <w14:ligatures w14:val="standardContextual"/>
+        </w:rPr>
+      </w:pPr>
+      <w:r>
+        <w:rPr>
+          <w:rFonts w:asciiTheme="minorHAnsi" w:eastAsiaTheme="minorHAnsi" w:hAnsiTheme="minorHAnsi" w:cstheme="minorBidi"/>
+          <w:kern w:val="2"/>
+          <w:sz w:val="22"/>
+          <w:szCs w:val="22"/>
+          <w:lang w:val="el-GR" w:eastAsia="en-US"/>
+          <w14:ligatures w14:val="standardContextual"/>
+        </w:rPr>
+        <w:t>45–54</w:t>
+      </w:r>
+    </w:p>
+    <w:p>
+      <w:pPr>
+        <w:pStyle w:val="NormalWeb"/>
+        <w:numPr>
+          <w:ilvl w:val="0"/>
+          <w:numId w:val="20"/>
+        </w:numPr>
+        <w:rPr>
+          <w:rFonts w:asciiTheme="minorHAnsi" w:eastAsiaTheme="minorHAnsi" w:hAnsiTheme="minorHAnsi" w:cstheme="minorBidi"/>
+          <w:kern w:val="2"/>
+          <w:sz w:val="22"/>
+          <w:szCs w:val="22"/>
+          <w:lang w:val="el-GR" w:eastAsia="en-US"/>
+          <w14:ligatures w14:val="standardContextual"/>
+        </w:rPr>
+      </w:pPr>
+      <w:r>
+        <w:rPr>
+          <w:rFonts w:asciiTheme="minorHAnsi" w:eastAsiaTheme="minorHAnsi" w:hAnsiTheme="minorHAnsi" w:cstheme="minorBidi"/>
+          <w:kern w:val="2"/>
+          <w:sz w:val="22"/>
+          <w:szCs w:val="22"/>
+          <w:lang w:val="el-GR" w:eastAsia="en-US"/>
+          <w14:ligatures w14:val="standardContextual"/>
+        </w:rPr>
+        <w:t>55–64</w:t>
+      </w:r>
+    </w:p>
+    <w:p>
+      <w:pPr>
+        <w:pStyle w:val="NormalWeb"/>
+        <w:numPr>
+          <w:ilvl w:val="0"/>
+          <w:numId w:val="20"/>
+        </w:numPr>
+        <w:rPr>
+          <w:rFonts w:asciiTheme="minorHAnsi" w:eastAsiaTheme="minorHAnsi" w:hAnsiTheme="minorHAnsi" w:cstheme="minorBidi"/>
+          <w:kern w:val="2"/>
+          <w:sz w:val="22"/>
+          <w:szCs w:val="22"/>
+          <w:lang w:val="el-GR" w:eastAsia="en-US"/>
+          <w14:ligatures w14:val="standardContextual"/>
+        </w:rPr>
+      </w:pPr>
+      <w:r>
+        <w:rPr>
+          <w:rFonts w:asciiTheme="minorHAnsi" w:eastAsiaTheme="minorHAnsi" w:hAnsiTheme="minorHAnsi" w:cstheme="minorBidi"/>
+          <w:kern w:val="2"/>
+          <w:sz w:val="22"/>
+          <w:szCs w:val="22"/>
+          <w:lang w:val="el-GR" w:eastAsia="en-US"/>
+          <w14:ligatures w14:val="standardContextual"/>
+        </w:rPr>
+        <w:t xml:space="preserve">65 και </w:t>
+      </w:r>
+      <w:proofErr w:type="spellStart"/>
+      <w:r>
+        <w:rPr>
+          <w:rFonts w:asciiTheme="minorHAnsi" w:eastAsiaTheme="minorHAnsi" w:hAnsiTheme="minorHAnsi" w:cstheme="minorBidi"/>
+          <w:kern w:val="2"/>
+          <w:sz w:val="22"/>
+          <w:szCs w:val="22"/>
+          <w:lang w:val="el-GR" w:eastAsia="en-US"/>
+          <w14:ligatures w14:val="standardContextual"/>
+        </w:rPr>
+        <w:t>άνω</w:t>
+      </w:r>
+      <w:proofErr w:type="spellEnd"/>
+    </w:p>
+    <w:p>
+      <w:pPr>
+        <w:pStyle w:val="NormalWeb"/>
+        <w:numPr>
+          <w:ilvl w:val="0"/>
+          <w:numId w:val="20"/>
+        </w:numPr>
+        <w:rPr>
+          <w:rFonts w:asciiTheme="minorHAnsi" w:eastAsiaTheme="minorHAnsi" w:hAnsiTheme="minorHAnsi" w:cstheme="minorBidi"/>
+          <w:kern w:val="2"/>
+          <w:sz w:val="22"/>
+          <w:szCs w:val="22"/>
+          <w:lang w:val="el-GR" w:eastAsia="en-US"/>
+          <w14:ligatures w14:val="standardContextual"/>
+        </w:rPr>
+      </w:pPr>
+      <w:proofErr w:type="spellStart"/>
+      <w:r>
+        <w:rPr>
+          <w:rFonts w:asciiTheme="minorHAnsi" w:eastAsiaTheme="minorHAnsi" w:hAnsiTheme="minorHAnsi" w:cstheme="minorBidi"/>
+          <w:kern w:val="2"/>
+          <w:sz w:val="22"/>
+          <w:szCs w:val="22"/>
+          <w:lang w:val="el-GR" w:eastAsia="en-US"/>
+          <w14:ligatures w14:val="standardContextual"/>
+        </w:rPr>
+        <w:t>Δεν</w:t>
+      </w:r>
+      <w:proofErr w:type="spellEnd"/>
+      <w:r>
+        <w:rPr>
+          <w:rFonts w:asciiTheme="minorHAnsi" w:eastAsiaTheme="minorHAnsi" w:hAnsiTheme="minorHAnsi" w:cstheme="minorBidi"/>
+          <w:kern w:val="2"/>
+          <w:sz w:val="22"/>
+          <w:szCs w:val="22"/>
+          <w:lang w:val="el-GR" w:eastAsia="en-US"/>
+          <w14:ligatures w14:val="standardContextual"/>
+        </w:rPr>
+        <w:t xml:space="preserve"> επ</w:t>
+      </w:r>
+      <w:proofErr w:type="spellStart"/>
+      <w:r>
+        <w:rPr>
+          <w:rFonts w:asciiTheme="minorHAnsi" w:eastAsiaTheme="minorHAnsi" w:hAnsiTheme="minorHAnsi" w:cstheme="minorBidi"/>
+          <w:kern w:val="2"/>
+          <w:sz w:val="22"/>
+          <w:szCs w:val="22"/>
+          <w:lang w:val="el-GR" w:eastAsia="en-US"/>
+          <w14:ligatures w14:val="standardContextual"/>
+        </w:rPr>
+        <w:t>ιθυμώ</w:t>
+      </w:r>
+      <w:proofErr w:type="spellEnd"/>
+      <w:r>
+        <w:rPr>
+          <w:rFonts w:asciiTheme="minorHAnsi" w:eastAsiaTheme="minorHAnsi" w:hAnsiTheme="minorHAnsi" w:cstheme="minorBidi"/>
+          <w:kern w:val="2"/>
+          <w:sz w:val="22"/>
+          <w:szCs w:val="22"/>
+          <w:lang w:val="el-GR" w:eastAsia="en-US"/>
+          <w14:ligatures w14:val="standardContextual"/>
+        </w:rPr>
+        <w:t xml:space="preserve"> να απα</w:t>
+      </w:r>
+      <w:proofErr w:type="spellStart"/>
+      <w:r>
+        <w:rPr>
+          <w:rFonts w:asciiTheme="minorHAnsi" w:eastAsiaTheme="minorHAnsi" w:hAnsiTheme="minorHAnsi" w:cstheme="minorBidi"/>
+          <w:kern w:val="2"/>
+          <w:sz w:val="22"/>
+          <w:szCs w:val="22"/>
+          <w:lang w:val="el-GR" w:eastAsia="en-US"/>
+          <w14:ligatures w14:val="standardContextual"/>
+        </w:rPr>
+        <w:t>ντήσω</w:t>
+      </w:r>
+      <w:proofErr w:type="spellEnd"/>
+    </w:p>
+    <w:p>
+      <w:pPr>
+        <w:pStyle w:val="ListParagraph"/>
+        <w:rPr>
+          <w:lang w:val="en-GB"/>
+        </w:rPr>
+      </w:pPr>
+    </w:p>
+    <w:p>
+      <w:pPr>
         <w:pStyle w:val="ListParagraph"/>
         <w:numPr>
           <w:ilvl w:val="0"/>
@@ -71,71 +403,18 @@
           <w:ilvl w:val="0"/>
           <w:numId w:val="15"/>
         </w:numPr>
+      </w:pPr>
+      <w:r>
+        <w:t xml:space="preserve">Η Σελίδα </w:t>
+      </w:r>
+      <w:r>
         <w:rPr>
           <w:lang w:val="en-GB"/>
         </w:rPr>
-      </w:pPr>
-      <w:r>
-        <w:rPr>
-          <w:lang w:val="en-GB"/>
-        </w:rPr>
-        <w:t xml:space="preserve">Η </w:t>
-      </w:r>
-      <w:proofErr w:type="spellStart"/>
-      <w:r>
-        <w:rPr>
-          <w:lang w:val="en-GB"/>
-        </w:rPr>
-        <w:t>Σελίδ</w:t>
-      </w:r>
-      <w:proofErr w:type="spellEnd"/>
-      <w:r>
-        <w:rPr>
-          <w:lang w:val="en-GB"/>
-        </w:rPr>
-        <w:t xml:space="preserve">α A </w:t>
-      </w:r>
-      <w:proofErr w:type="spellStart"/>
-      <w:r>
-        <w:rPr>
-          <w:lang w:val="en-GB"/>
-        </w:rPr>
-        <w:t>ήτ</w:t>
-      </w:r>
-      <w:proofErr w:type="spellEnd"/>
-      <w:r>
-        <w:rPr>
-          <w:lang w:val="en-GB"/>
-        </w:rPr>
-        <w:t xml:space="preserve">αν </w:t>
-      </w:r>
-      <w:proofErr w:type="spellStart"/>
-      <w:r>
-        <w:rPr>
-          <w:lang w:val="en-GB"/>
-        </w:rPr>
-        <w:t>εύκολη</w:t>
-      </w:r>
-      <w:proofErr w:type="spellEnd"/>
-      <w:r>
-        <w:rPr>
-          <w:lang w:val="en-GB"/>
-        </w:rPr>
-        <w:t xml:space="preserve"> στην π</w:t>
-      </w:r>
-      <w:proofErr w:type="spellStart"/>
-      <w:r>
-        <w:rPr>
-          <w:lang w:val="en-GB"/>
-        </w:rPr>
-        <w:t>λοήγηση</w:t>
-      </w:r>
-      <w:proofErr w:type="spellEnd"/>
-      <w:r>
-        <w:rPr>
-          <w:lang w:val="en-GB"/>
-        </w:rPr>
-        <w:t>.</w:t>
+        <w:t>A</w:t>
+      </w:r>
+      <w:r>
+        <w:t xml:space="preserve"> ήταν εύκολη στην πλοήγηση.</w:t>
       </w:r>
     </w:p>
     <w:p>
@@ -145,107 +424,18 @@
           <w:ilvl w:val="0"/>
           <w:numId w:val="15"/>
         </w:numPr>
+      </w:pPr>
+      <w:r>
+        <w:t xml:space="preserve">Οι πληροφορίες στη Σελίδα </w:t>
+      </w:r>
+      <w:r>
         <w:rPr>
           <w:lang w:val="en-GB"/>
         </w:rPr>
-      </w:pPr>
-      <w:proofErr w:type="spellStart"/>
-      <w:r>
-        <w:rPr>
-          <w:lang w:val="en-GB"/>
-        </w:rPr>
-        <w:t>Οι</w:t>
-      </w:r>
-      <w:proofErr w:type="spellEnd"/>
-      <w:r>
-        <w:rPr>
-          <w:lang w:val="en-GB"/>
-        </w:rPr>
-        <w:t xml:space="preserve"> π</w:t>
-      </w:r>
-      <w:proofErr w:type="spellStart"/>
-      <w:r>
-        <w:rPr>
-          <w:lang w:val="en-GB"/>
-        </w:rPr>
-        <w:t>ληροφορίες</w:t>
-      </w:r>
-      <w:proofErr w:type="spellEnd"/>
-      <w:r>
-        <w:rPr>
-          <w:lang w:val="en-GB"/>
-        </w:rPr>
-        <w:t xml:space="preserve"> </w:t>
-      </w:r>
-      <w:proofErr w:type="spellStart"/>
-      <w:r>
-        <w:rPr>
-          <w:lang w:val="en-GB"/>
-        </w:rPr>
-        <w:t>στη</w:t>
-      </w:r>
-      <w:proofErr w:type="spellEnd"/>
-      <w:r>
-        <w:rPr>
-          <w:lang w:val="en-GB"/>
-        </w:rPr>
-        <w:t xml:space="preserve"> </w:t>
-      </w:r>
-      <w:proofErr w:type="spellStart"/>
-      <w:r>
-        <w:rPr>
-          <w:lang w:val="en-GB"/>
-        </w:rPr>
-        <w:t>Σελίδ</w:t>
-      </w:r>
-      <w:proofErr w:type="spellEnd"/>
-      <w:r>
-        <w:rPr>
-          <w:lang w:val="en-GB"/>
-        </w:rPr>
-        <w:t xml:space="preserve">α A </w:t>
-      </w:r>
-      <w:proofErr w:type="spellStart"/>
-      <w:r>
-        <w:rPr>
-          <w:lang w:val="en-GB"/>
-        </w:rPr>
-        <w:t>ήτ</w:t>
-      </w:r>
-      <w:proofErr w:type="spellEnd"/>
-      <w:r>
-        <w:rPr>
-          <w:lang w:val="en-GB"/>
-        </w:rPr>
-        <w:t xml:space="preserve">αν </w:t>
-      </w:r>
-      <w:proofErr w:type="spellStart"/>
-      <w:r>
-        <w:rPr>
-          <w:lang w:val="en-GB"/>
-        </w:rPr>
-        <w:t>εύκολες</w:t>
-      </w:r>
-      <w:proofErr w:type="spellEnd"/>
-      <w:r>
-        <w:rPr>
-          <w:lang w:val="en-GB"/>
-        </w:rPr>
-        <w:t xml:space="preserve"> να β</w:t>
-      </w:r>
-      <w:proofErr w:type="spellStart"/>
-      <w:r>
-        <w:rPr>
-          <w:lang w:val="en-GB"/>
-        </w:rPr>
-        <w:t>ρεθούν</w:t>
-      </w:r>
-      <w:proofErr w:type="spellEnd"/>
-      <w:r>
-        <w:rPr>
-          <w:lang w:val="en-GB"/>
-        </w:rPr>
-        <w:t>.</w:t>
+        <w:t>A</w:t>
+      </w:r>
+      <w:r>
+        <w:t xml:space="preserve"> ήταν εύκολες να βρεθούν.</w:t>
       </w:r>
     </w:p>
     <w:p>
@@ -255,113 +445,18 @@
           <w:ilvl w:val="0"/>
           <w:numId w:val="15"/>
         </w:numPr>
+      </w:pPr>
+      <w:r>
+        <w:t xml:space="preserve">Η διάταξη της Σελίδας </w:t>
+      </w:r>
+      <w:r>
         <w:rPr>
           <w:lang w:val="en-GB"/>
         </w:rPr>
-      </w:pPr>
-      <w:r>
-        <w:rPr>
-          <w:lang w:val="en-GB"/>
-        </w:rPr>
-        <w:t xml:space="preserve">Η </w:t>
-      </w:r>
-      <w:proofErr w:type="spellStart"/>
-      <w:r>
-        <w:rPr>
-          <w:lang w:val="en-GB"/>
-        </w:rPr>
-        <w:t>διάτ</w:t>
-      </w:r>
-      <w:proofErr w:type="spellEnd"/>
-      <w:r>
-        <w:rPr>
-          <w:lang w:val="en-GB"/>
-        </w:rPr>
-        <w:t xml:space="preserve">αξη </w:t>
-      </w:r>
-      <w:proofErr w:type="spellStart"/>
-      <w:r>
-        <w:rPr>
-          <w:lang w:val="en-GB"/>
-        </w:rPr>
-        <w:t>της</w:t>
-      </w:r>
-      <w:proofErr w:type="spellEnd"/>
-      <w:r>
-        <w:rPr>
-          <w:lang w:val="en-GB"/>
-        </w:rPr>
-        <w:t xml:space="preserve"> </w:t>
-      </w:r>
-      <w:proofErr w:type="spellStart"/>
-      <w:r>
-        <w:rPr>
-          <w:lang w:val="en-GB"/>
-        </w:rPr>
-        <w:t>Σελίδ</w:t>
-      </w:r>
-      <w:proofErr w:type="spellEnd"/>
-      <w:r>
-        <w:rPr>
-          <w:lang w:val="en-GB"/>
-        </w:rPr>
-        <w:t xml:space="preserve">ας A </w:t>
-      </w:r>
-      <w:proofErr w:type="spellStart"/>
-      <w:r>
-        <w:rPr>
-          <w:lang w:val="en-GB"/>
-        </w:rPr>
-        <w:t>ήτ</w:t>
-      </w:r>
-      <w:proofErr w:type="spellEnd"/>
-      <w:r>
-        <w:rPr>
-          <w:lang w:val="en-GB"/>
-        </w:rPr>
-        <w:t xml:space="preserve">αν </w:t>
-      </w:r>
-      <w:proofErr w:type="spellStart"/>
-      <w:r>
-        <w:rPr>
-          <w:lang w:val="en-GB"/>
-        </w:rPr>
-        <w:t>ξεκάθ</w:t>
-      </w:r>
-      <w:proofErr w:type="spellEnd"/>
-      <w:r>
-        <w:rPr>
-          <w:lang w:val="en-GB"/>
-        </w:rPr>
-        <w:t>αρη και κα</w:t>
-      </w:r>
-      <w:proofErr w:type="spellStart"/>
-      <w:r>
-        <w:rPr>
-          <w:lang w:val="en-GB"/>
-        </w:rPr>
-        <w:t>λά</w:t>
-      </w:r>
-      <w:proofErr w:type="spellEnd"/>
-      <w:r>
-        <w:rPr>
-          <w:lang w:val="en-GB"/>
-        </w:rPr>
-        <w:t xml:space="preserve"> </w:t>
-      </w:r>
-      <w:proofErr w:type="spellStart"/>
-      <w:r>
-        <w:rPr>
-          <w:lang w:val="en-GB"/>
-        </w:rPr>
-        <w:t>οργ</w:t>
-      </w:r>
-      <w:proofErr w:type="spellEnd"/>
-      <w:r>
-        <w:rPr>
-          <w:lang w:val="en-GB"/>
-        </w:rPr>
-        <w:t>ανωμένη.</w:t>
+        <w:t>A</w:t>
+      </w:r>
+      <w:r>
+        <w:t xml:space="preserve"> ήταν ξεκάθαρη και καλά οργανωμένη.</w:t>
       </w:r>
     </w:p>
     <w:p>
@@ -371,99 +466,18 @@
           <w:ilvl w:val="0"/>
           <w:numId w:val="15"/>
         </w:numPr>
+      </w:pPr>
+      <w:r>
+        <w:t xml:space="preserve">Ο σχεδιασμός της Σελίδας </w:t>
+      </w:r>
+      <w:r>
         <w:rPr>
           <w:lang w:val="en-GB"/>
         </w:rPr>
-      </w:pPr>
-      <w:r>
-        <w:rPr>
-          <w:lang w:val="en-GB"/>
-        </w:rPr>
-        <w:t xml:space="preserve">Ο </w:t>
-      </w:r>
-      <w:proofErr w:type="spellStart"/>
-      <w:r>
-        <w:rPr>
-          <w:lang w:val="en-GB"/>
-        </w:rPr>
-        <w:t>σχεδι</w:t>
-      </w:r>
-      <w:proofErr w:type="spellEnd"/>
-      <w:r>
-        <w:rPr>
-          <w:lang w:val="en-GB"/>
-        </w:rPr>
-        <w:t xml:space="preserve">ασμός </w:t>
-      </w:r>
-      <w:proofErr w:type="spellStart"/>
-      <w:r>
-        <w:rPr>
-          <w:lang w:val="en-GB"/>
-        </w:rPr>
-        <w:t>της</w:t>
-      </w:r>
-      <w:proofErr w:type="spellEnd"/>
-      <w:r>
-        <w:rPr>
-          <w:lang w:val="en-GB"/>
-        </w:rPr>
-        <w:t xml:space="preserve"> </w:t>
-      </w:r>
-      <w:proofErr w:type="spellStart"/>
-      <w:r>
-        <w:rPr>
-          <w:lang w:val="en-GB"/>
-        </w:rPr>
-        <w:t>Σελίδ</w:t>
-      </w:r>
-      <w:proofErr w:type="spellEnd"/>
-      <w:r>
-        <w:rPr>
-          <w:lang w:val="en-GB"/>
-        </w:rPr>
-        <w:t xml:space="preserve">ας A </w:t>
-      </w:r>
-      <w:proofErr w:type="spellStart"/>
-      <w:r>
-        <w:rPr>
-          <w:lang w:val="en-GB"/>
-        </w:rPr>
-        <w:t>ήτ</w:t>
-      </w:r>
-      <w:proofErr w:type="spellEnd"/>
-      <w:r>
-        <w:rPr>
-          <w:lang w:val="en-GB"/>
-        </w:rPr>
-        <w:t>αν οπ</w:t>
-      </w:r>
-      <w:proofErr w:type="spellStart"/>
-      <w:r>
-        <w:rPr>
-          <w:lang w:val="en-GB"/>
-        </w:rPr>
-        <w:t>τικά</w:t>
-      </w:r>
-      <w:proofErr w:type="spellEnd"/>
-      <w:r>
-        <w:rPr>
-          <w:lang w:val="en-GB"/>
-        </w:rPr>
-        <w:t xml:space="preserve"> </w:t>
-      </w:r>
-      <w:proofErr w:type="spellStart"/>
-      <w:r>
-        <w:rPr>
-          <w:lang w:val="en-GB"/>
-        </w:rPr>
-        <w:t>ελκυστικός</w:t>
-      </w:r>
-      <w:proofErr w:type="spellEnd"/>
-      <w:r>
-        <w:rPr>
-          <w:lang w:val="en-GB"/>
-        </w:rPr>
-        <w:t>.</w:t>
+        <w:t>A</w:t>
+      </w:r>
+      <w:r>
+        <w:t xml:space="preserve"> ήταν οπτικά ελκυστικός.</w:t>
       </w:r>
     </w:p>
     <w:p>
@@ -473,107 +487,18 @@
           <w:ilvl w:val="0"/>
           <w:numId w:val="15"/>
         </w:numPr>
+      </w:pPr>
+      <w:r>
+        <w:t xml:space="preserve">Η Σελίδα </w:t>
+      </w:r>
+      <w:r>
         <w:rPr>
           <w:lang w:val="en-GB"/>
         </w:rPr>
-      </w:pPr>
-      <w:proofErr w:type="spellStart"/>
-      <w:r>
-        <w:rPr>
-          <w:lang w:val="en-GB"/>
-        </w:rPr>
-        <w:t>Το</w:t>
-      </w:r>
-      <w:proofErr w:type="spellEnd"/>
-      <w:r>
-        <w:rPr>
-          <w:lang w:val="en-GB"/>
-        </w:rPr>
-        <w:t xml:space="preserve"> </w:t>
-      </w:r>
-      <w:proofErr w:type="spellStart"/>
-      <w:r>
-        <w:rPr>
-          <w:lang w:val="en-GB"/>
-        </w:rPr>
-        <w:t>κείμενο</w:t>
-      </w:r>
-      <w:proofErr w:type="spellEnd"/>
-      <w:r>
-        <w:rPr>
-          <w:lang w:val="en-GB"/>
-        </w:rPr>
-        <w:t xml:space="preserve"> </w:t>
-      </w:r>
-      <w:proofErr w:type="spellStart"/>
-      <w:r>
-        <w:rPr>
-          <w:lang w:val="en-GB"/>
-        </w:rPr>
-        <w:t>στη</w:t>
-      </w:r>
-      <w:proofErr w:type="spellEnd"/>
-      <w:r>
-        <w:rPr>
-          <w:lang w:val="en-GB"/>
-        </w:rPr>
-        <w:t xml:space="preserve"> </w:t>
-      </w:r>
-      <w:proofErr w:type="spellStart"/>
-      <w:r>
-        <w:rPr>
-          <w:lang w:val="en-GB"/>
-        </w:rPr>
-        <w:t>Σελίδ</w:t>
-      </w:r>
-      <w:proofErr w:type="spellEnd"/>
-      <w:r>
-        <w:rPr>
-          <w:lang w:val="en-GB"/>
-        </w:rPr>
-        <w:t xml:space="preserve">α A </w:t>
-      </w:r>
-      <w:proofErr w:type="spellStart"/>
-      <w:r>
-        <w:rPr>
-          <w:lang w:val="en-GB"/>
-        </w:rPr>
-        <w:t>ήτ</w:t>
-      </w:r>
-      <w:proofErr w:type="spellEnd"/>
-      <w:r>
-        <w:rPr>
-          <w:lang w:val="en-GB"/>
-        </w:rPr>
-        <w:t xml:space="preserve">αν </w:t>
-      </w:r>
-      <w:proofErr w:type="spellStart"/>
-      <w:r>
-        <w:rPr>
-          <w:lang w:val="en-GB"/>
-        </w:rPr>
-        <w:t>ευ</w:t>
-      </w:r>
-      <w:proofErr w:type="spellEnd"/>
-      <w:r>
-        <w:rPr>
-          <w:lang w:val="en-GB"/>
-        </w:rPr>
-        <w:t>ανάγνωστο και κατα</w:t>
-      </w:r>
-      <w:proofErr w:type="spellStart"/>
-      <w:r>
-        <w:rPr>
-          <w:lang w:val="en-GB"/>
-        </w:rPr>
-        <w:t>νοητό</w:t>
-      </w:r>
-      <w:proofErr w:type="spellEnd"/>
-      <w:r>
-        <w:rPr>
-          <w:lang w:val="en-GB"/>
-        </w:rPr>
-        <w:t>.</w:t>
+        <w:t>A</w:t>
+      </w:r>
+      <w:r>
+        <w:t xml:space="preserve"> φαινόταν επαγγελματική και αξιόπιστη.</w:t>
       </w:r>
     </w:p>
     <w:p>
@@ -583,71 +508,32 @@
           <w:ilvl w:val="0"/>
           <w:numId w:val="15"/>
         </w:numPr>
+      </w:pPr>
+      <w:r>
+        <w:t xml:space="preserve">Συνολικά, είμαι ικανοποιημένος/η με τη Σελίδα </w:t>
+      </w:r>
+      <w:r>
         <w:rPr>
           <w:lang w:val="en-GB"/>
         </w:rPr>
-      </w:pPr>
-      <w:r>
-        <w:rPr>
-          <w:lang w:val="en-GB"/>
-        </w:rPr>
-        <w:t xml:space="preserve">Η </w:t>
-      </w:r>
-      <w:proofErr w:type="spellStart"/>
-      <w:r>
-        <w:rPr>
-          <w:lang w:val="en-GB"/>
-        </w:rPr>
-        <w:t>Σελίδ</w:t>
-      </w:r>
-      <w:proofErr w:type="spellEnd"/>
-      <w:r>
-        <w:rPr>
-          <w:lang w:val="en-GB"/>
-        </w:rPr>
-        <w:t>α A φα</w:t>
-      </w:r>
-      <w:proofErr w:type="spellStart"/>
-      <w:r>
-        <w:rPr>
-          <w:lang w:val="en-GB"/>
-        </w:rPr>
-        <w:t>ινότ</w:t>
-      </w:r>
-      <w:proofErr w:type="spellEnd"/>
-      <w:r>
-        <w:rPr>
-          <w:lang w:val="en-GB"/>
-        </w:rPr>
-        <w:t>αν επα</w:t>
-      </w:r>
-      <w:proofErr w:type="spellStart"/>
-      <w:r>
-        <w:rPr>
-          <w:lang w:val="en-GB"/>
-        </w:rPr>
-        <w:t>γγελμ</w:t>
-      </w:r>
-      <w:proofErr w:type="spellEnd"/>
-      <w:r>
-        <w:rPr>
-          <w:lang w:val="en-GB"/>
-        </w:rPr>
-        <w:t>ατική και α</w:t>
-      </w:r>
-      <w:proofErr w:type="spellStart"/>
-      <w:r>
-        <w:rPr>
-          <w:lang w:val="en-GB"/>
-        </w:rPr>
-        <w:t>ξιό</w:t>
-      </w:r>
-      <w:proofErr w:type="spellEnd"/>
-      <w:r>
-        <w:rPr>
-          <w:lang w:val="en-GB"/>
-        </w:rPr>
-        <w:t>πιστη.</w:t>
+        <w:t>A</w:t>
+      </w:r>
+      <w:r>
+        <w:t>.</w:t>
+      </w:r>
+    </w:p>
+    <w:p>
+      <w:r>
+        <w:t>2</w:t>
+      </w:r>
+      <w:r>
+        <w:rPr>
+          <w:vertAlign w:val="superscript"/>
+        </w:rPr>
+        <w:t>η</w:t>
+      </w:r>
+      <w:r>
+        <w:t xml:space="preserve"> σελίδα</w:t>
       </w:r>
     </w:p>
     <w:p>
@@ -657,71 +543,18 @@
           <w:ilvl w:val="0"/>
           <w:numId w:val="15"/>
         </w:numPr>
+      </w:pPr>
+      <w:r>
+        <w:t xml:space="preserve">Η Σελίδα </w:t>
+      </w:r>
+      <w:r>
         <w:rPr>
           <w:lang w:val="en-GB"/>
         </w:rPr>
-      </w:pPr>
-      <w:r>
-        <w:rPr>
-          <w:lang w:val="en-GB"/>
-        </w:rPr>
-        <w:t xml:space="preserve">Η </w:t>
-      </w:r>
-      <w:proofErr w:type="spellStart"/>
-      <w:r>
-        <w:rPr>
-          <w:lang w:val="en-GB"/>
-        </w:rPr>
-        <w:t>Σελίδ</w:t>
-      </w:r>
-      <w:proofErr w:type="spellEnd"/>
-      <w:r>
-        <w:rPr>
-          <w:lang w:val="en-GB"/>
-        </w:rPr>
-        <w:t xml:space="preserve">α A </w:t>
-      </w:r>
-      <w:proofErr w:type="spellStart"/>
-      <w:r>
-        <w:rPr>
-          <w:lang w:val="en-GB"/>
-        </w:rPr>
-        <w:t>λειτουργούσε</w:t>
-      </w:r>
-      <w:proofErr w:type="spellEnd"/>
-      <w:r>
-        <w:rPr>
-          <w:lang w:val="en-GB"/>
-        </w:rPr>
-        <w:t xml:space="preserve"> </w:t>
-      </w:r>
-      <w:proofErr w:type="spellStart"/>
-      <w:r>
-        <w:rPr>
-          <w:lang w:val="en-GB"/>
-        </w:rPr>
-        <w:t>ομ</w:t>
-      </w:r>
-      <w:proofErr w:type="spellEnd"/>
-      <w:r>
-        <w:rPr>
-          <w:lang w:val="en-GB"/>
-        </w:rPr>
-        <w:t>αλά (τα</w:t>
-      </w:r>
-      <w:proofErr w:type="spellStart"/>
-      <w:r>
-        <w:rPr>
-          <w:lang w:val="en-GB"/>
-        </w:rPr>
-        <w:t>χύτητ</w:t>
-      </w:r>
-      <w:proofErr w:type="spellEnd"/>
-      <w:r>
-        <w:rPr>
-          <w:lang w:val="en-GB"/>
-        </w:rPr>
-        <w:t>α/φόρτωση).</w:t>
+        <w:t>B</w:t>
+      </w:r>
+      <w:r>
+        <w:t xml:space="preserve"> ήταν εύκολη στην πλοήγηση.</w:t>
       </w:r>
     </w:p>
     <w:p>
@@ -731,96 +564,18 @@
           <w:ilvl w:val="0"/>
           <w:numId w:val="15"/>
         </w:numPr>
+      </w:pPr>
+      <w:r>
+        <w:t xml:space="preserve">Οι πληροφορίες στη Σελίδα </w:t>
+      </w:r>
+      <w:r>
         <w:rPr>
           <w:lang w:val="en-GB"/>
         </w:rPr>
-      </w:pPr>
-      <w:proofErr w:type="spellStart"/>
-      <w:r>
-        <w:rPr>
-          <w:lang w:val="en-GB"/>
-        </w:rPr>
-        <w:t>Συνολικά</w:t>
-      </w:r>
-      <w:proofErr w:type="spellEnd"/>
-      <w:r>
-        <w:rPr>
-          <w:lang w:val="en-GB"/>
-        </w:rPr>
-        <w:t xml:space="preserve">, </w:t>
-      </w:r>
-      <w:proofErr w:type="spellStart"/>
-      <w:r>
-        <w:rPr>
-          <w:lang w:val="en-GB"/>
-        </w:rPr>
-        <w:t>είμ</w:t>
-      </w:r>
-      <w:proofErr w:type="spellEnd"/>
-      <w:r>
-        <w:rPr>
-          <w:lang w:val="en-GB"/>
-        </w:rPr>
-        <w:t xml:space="preserve">αι </w:t>
-      </w:r>
-      <w:proofErr w:type="spellStart"/>
-      <w:r>
-        <w:rPr>
-          <w:lang w:val="en-GB"/>
-        </w:rPr>
-        <w:t>ικ</w:t>
-      </w:r>
-      <w:proofErr w:type="spellEnd"/>
-      <w:r>
-        <w:rPr>
-          <w:lang w:val="en-GB"/>
-        </w:rPr>
-        <w:t xml:space="preserve">ανοποιημένος/η με </w:t>
-      </w:r>
-      <w:proofErr w:type="spellStart"/>
-      <w:r>
-        <w:rPr>
-          <w:lang w:val="en-GB"/>
-        </w:rPr>
-        <w:t>τη</w:t>
-      </w:r>
-      <w:proofErr w:type="spellEnd"/>
-      <w:r>
-        <w:rPr>
-          <w:lang w:val="en-GB"/>
-        </w:rPr>
-        <w:t xml:space="preserve"> </w:t>
-      </w:r>
-      <w:proofErr w:type="spellStart"/>
-      <w:r>
-        <w:rPr>
-          <w:lang w:val="en-GB"/>
-        </w:rPr>
-        <w:t>Σελίδ</w:t>
-      </w:r>
-      <w:proofErr w:type="spellEnd"/>
-      <w:r>
-        <w:rPr>
-          <w:lang w:val="en-GB"/>
-        </w:rPr>
-        <w:t>α A.</w:t>
-      </w:r>
-    </w:p>
-    <w:p>
-      <w:r>
-        <w:t>2</w:t>
-      </w:r>
-      <w:r>
-        <w:rPr>
-          <w:vertAlign w:val="superscript"/>
-        </w:rPr>
-        <w:t>η</w:t>
-      </w:r>
-      <w:r>
-        <w:t xml:space="preserve"> </w:t>
-      </w:r>
-      <w:r>
-        <w:t>σελίδα</w:t>
+        <w:t>B</w:t>
+      </w:r>
+      <w:r>
+        <w:t xml:space="preserve"> ήταν εύκολες να βρεθούν.</w:t>
       </w:r>
     </w:p>
     <w:p>
@@ -832,7 +587,7 @@
         </w:numPr>
       </w:pPr>
       <w:r>
-        <w:t xml:space="preserve">Η Σελίδα </w:t>
+        <w:t xml:space="preserve">Η διάταξη της Σελίδας </w:t>
       </w:r>
       <w:r>
         <w:rPr>
@@ -841,7 +596,7 @@
         <w:t>B</w:t>
       </w:r>
       <w:r>
-        <w:t xml:space="preserve"> ήταν εύκολη στην πλοήγηση.</w:t>
+        <w:t xml:space="preserve"> ήταν ξεκάθαρη και καλά οργανωμένη.</w:t>
       </w:r>
     </w:p>
     <w:p>
@@ -853,7 +608,7 @@
         </w:numPr>
       </w:pPr>
       <w:r>
-        <w:t xml:space="preserve">Οι πληροφορίες στη Σελίδα </w:t>
+        <w:t xml:space="preserve">Ο σχεδιασμός της Σελίδας </w:t>
       </w:r>
       <w:r>
         <w:rPr>
@@ -862,7 +617,7 @@
         <w:t>B</w:t>
       </w:r>
       <w:r>
-        <w:t xml:space="preserve"> ήταν εύκολες να βρεθούν.</w:t>
+        <w:t xml:space="preserve"> ήταν οπτικά ελκυστικός.</w:t>
       </w:r>
     </w:p>
     <w:p>
@@ -874,7 +629,7 @@
         </w:numPr>
       </w:pPr>
       <w:r>
-        <w:t xml:space="preserve">Η διάταξη της Σελίδας </w:t>
+        <w:t xml:space="preserve">Η Σελίδα </w:t>
       </w:r>
       <w:r>
         <w:rPr>
@@ -883,7 +638,7 @@
         <w:t>B</w:t>
       </w:r>
       <w:r>
-        <w:t xml:space="preserve"> ήταν ξεκάθαρη και καλά οργανωμένη.</w:t>
+        <w:t xml:space="preserve"> φαινόταν επαγγελματική και αξιόπιστη.</w:t>
       </w:r>
     </w:p>
     <w:p>
@@ -895,7 +650,7 @@
         </w:numPr>
       </w:pPr>
       <w:r>
-        <w:t xml:space="preserve">Ο σχεδιασμός της Σελίδας </w:t>
+        <w:t xml:space="preserve">Συνολικά, είμαι ικανοποιημένος/η με τη Σελίδα </w:t>
       </w:r>
       <w:r>
         <w:rPr>
@@ -904,8 +659,20 @@
         <w:t>B</w:t>
       </w:r>
       <w:r>
-        <w:t xml:space="preserve"> ήταν οπτικά ελκυστικός.</w:t>
-      </w:r>
+        <w:t>.</w:t>
+      </w:r>
+    </w:p>
+    <w:p>
+      <w:pPr>
+        <w:rPr>
+          <w:lang w:val="en-GB"/>
+        </w:rPr>
+      </w:pPr>
+      <w:proofErr w:type="spellStart"/>
+      <w:r>
+        <w:t>Συγκριση</w:t>
+      </w:r>
+      <w:proofErr w:type="spellEnd"/>
     </w:p>
     <w:p>
       <w:pPr>
@@ -916,16 +683,25 @@
         </w:numPr>
       </w:pPr>
       <w:r>
-        <w:t xml:space="preserve">Το κείμενο στη Σελίδα </w:t>
-      </w:r>
-      <w:r>
-        <w:rPr>
-          <w:lang w:val="en-GB"/>
-        </w:rPr>
+        <w:t>Ποια σελίδα ήταν συνολικά πιο εύκολη στη χρήση;</w:t>
+      </w:r>
+      <w:r>
+        <w:br/>
+        <w:t xml:space="preserve">• Σελίδα </w:t>
+      </w:r>
+      <w:r>
+        <w:t>A</w:t>
+      </w:r>
+      <w:r>
+        <w:br/>
+        <w:t xml:space="preserve">• Σελίδα </w:t>
+      </w:r>
+      <w:r>
         <w:t>B</w:t>
       </w:r>
       <w:r>
-        <w:t xml:space="preserve"> ήταν ευανάγνωστο και κατανοητό.</w:t>
+        <w:br/>
+        <w:t>• Και οι δύο εξίσου</w:t>
       </w:r>
     </w:p>
     <w:p>
@@ -937,16 +713,25 @@
         </w:numPr>
       </w:pPr>
       <w:r>
-        <w:t xml:space="preserve">Η Σελίδα </w:t>
-      </w:r>
-      <w:r>
-        <w:rPr>
-          <w:lang w:val="en-GB"/>
-        </w:rPr>
+        <w:t>Ποια σελίδα είχε καλύτερο οπτικό σχεδιασμό;</w:t>
+      </w:r>
+      <w:r>
+        <w:br/>
+        <w:t xml:space="preserve">• Σελίδα </w:t>
+      </w:r>
+      <w:r>
+        <w:t>A</w:t>
+      </w:r>
+      <w:r>
+        <w:br/>
+        <w:t xml:space="preserve">• Σελίδα </w:t>
+      </w:r>
+      <w:r>
         <w:t>B</w:t>
       </w:r>
       <w:r>
-        <w:t xml:space="preserve"> φαινόταν επαγγελματική και αξιόπιστη.</w:t>
+        <w:br/>
+        <w:t>• Και οι δύο εξίσου</w:t>
       </w:r>
     </w:p>
     <w:p>
@@ -958,16 +743,21 @@
         </w:numPr>
       </w:pPr>
       <w:r>
-        <w:t xml:space="preserve">Η Σελίδα </w:t>
-      </w:r>
-      <w:r>
-        <w:rPr>
-          <w:lang w:val="en-GB"/>
-        </w:rPr>
-        <w:t>B</w:t>
-      </w:r>
-      <w:r>
-        <w:t xml:space="preserve"> λειτουργούσε ομαλά (ταχύτητα/φόρτωση).</w:t>
+        <w:t>Ποια σελίδα σας βοήθησε να βρείτε πακέτα/υπηρεσίες πιο γρήγορα;</w:t>
+      </w:r>
+      <w:r>
+        <w:br/>
+      </w:r>
+      <w:r>
+        <w:t>• Σελίδα A</w:t>
+      </w:r>
+      <w:r>
+        <w:br/>
+        <w:t>• Σελίδα B</w:t>
+      </w:r>
+      <w:r>
+        <w:br/>
+        <w:t>• Και οι δύο εξίσου</w:t>
       </w:r>
     </w:p>
     <w:p>
@@ -979,29 +769,27 @@
         </w:numPr>
       </w:pPr>
       <w:r>
-        <w:t xml:space="preserve">Συνολικά, είμαι ικανοποιημένος/η με τη Σελίδα </w:t>
-      </w:r>
-      <w:r>
-        <w:rPr>
-          <w:lang w:val="en-GB"/>
-        </w:rPr>
-        <w:t>B</w:t>
-      </w:r>
-      <w:r>
-        <w:t>.</w:t>
+        <w:t>Ποια σελίδα θα προτιμούσατε να χρησιμοποιείτε στην πραγματική ζωή;</w:t>
+      </w:r>
+      <w:r>
+        <w:br/>
+      </w:r>
+      <w:r>
+        <w:t>• Σελίδα A</w:t>
+      </w:r>
+      <w:r>
+        <w:br/>
+        <w:t>• Σελίδα B</w:t>
+      </w:r>
+      <w:r>
+        <w:br/>
+        <w:t>• Καμία προτίμηση</w:t>
       </w:r>
     </w:p>
     <w:p>
       <w:pPr>
-        <w:rPr>
-          <w:lang w:val="en-GB"/>
-        </w:rPr>
-      </w:pPr>
-      <w:proofErr w:type="spellStart"/>
-      <w:r>
-        <w:t>Συγκριση</w:t>
-      </w:r>
-      <w:proofErr w:type="spellEnd"/>
+        <w:pStyle w:val="ListParagraph"/>
+      </w:pPr>
     </w:p>
     <w:p>
       <w:pPr>
@@ -1010,28 +798,18 @@
           <w:ilvl w:val="0"/>
           <w:numId w:val="15"/>
         </w:numPr>
-      </w:pPr>
-      <w:r>
-        <w:t>Ποια σελίδα ήταν συνολικά πιο εύκολη στη χρήση;</w:t>
-      </w:r>
-      <w:r>
-        <w:br/>
-        <w:t xml:space="preserve">• Σελίδα </w:t>
-      </w:r>
-      <w:r>
-        <w:t>A</w:t>
-      </w:r>
-      <w:r>
-        <w:br/>
-        <w:t xml:space="preserve">• Σελίδα </w:t>
-      </w:r>
-      <w:r>
-        <w:t>B</w:t>
-      </w:r>
-      <w:r>
-        <w:br/>
-        <w:t>• Και οι δύο εξίσου</w:t>
-      </w:r>
+        <w:rPr>
+          <w:lang w:val="en-GB"/>
+        </w:rPr>
+      </w:pPr>
+      <w:r>
+        <w:t>Προτάσεις βελτίωσης για σελίδα 1</w:t>
+      </w:r>
+    </w:p>
+    <w:p>
+      <w:pPr>
+        <w:pStyle w:val="ListParagraph"/>
+      </w:pPr>
     </w:p>
     <w:p>
       <w:pPr>
@@ -1040,175 +818,718 @@
           <w:ilvl w:val="0"/>
           <w:numId w:val="15"/>
         </w:numPr>
-      </w:pPr>
-      <w:r>
-        <w:t>Ποια σελίδα είχε καλύτερο οπτικό σχεδιασμό;</w:t>
-      </w:r>
-      <w:r>
-        <w:br/>
-        <w:t xml:space="preserve">• Σελίδα </w:t>
-      </w:r>
-      <w:r>
-        <w:t>A</w:t>
-      </w:r>
-      <w:r>
-        <w:br/>
-        <w:t xml:space="preserve">• Σελίδα </w:t>
-      </w:r>
-      <w:r>
-        <w:t>B</w:t>
-      </w:r>
-      <w:r>
-        <w:br/>
-        <w:t>• Και οι δύο εξίσου</w:t>
+        <w:rPr>
+          <w:lang w:val="en-GB"/>
+        </w:rPr>
+      </w:pPr>
+      <w:r>
+        <w:t>Προτάσεις βελτίωσης για σελίδα 2</w:t>
       </w:r>
     </w:p>
     <w:p>
       <w:pPr>
         <w:pStyle w:val="ListParagraph"/>
-        <w:numPr>
-          <w:ilvl w:val="0"/>
-          <w:numId w:val="15"/>
-        </w:numPr>
-      </w:pPr>
-      <w:r>
-        <w:t>Ποια σελίδα σας βοήθησε να βρείτε πακέτα/υπηρεσίες πιο γρήγορα;</w:t>
-      </w:r>
-      <w:r>
-        <w:br/>
-      </w:r>
-      <w:r>
-        <w:t xml:space="preserve">• </w:t>
-      </w:r>
-      <w:proofErr w:type="spellStart"/>
-      <w:r>
-        <w:t>Σελίδ</w:t>
-      </w:r>
-      <w:proofErr w:type="spellEnd"/>
-      <w:r>
-        <w:t>α A</w:t>
-      </w:r>
-      <w:r>
-        <w:br/>
-        <w:t xml:space="preserve">• </w:t>
-      </w:r>
-      <w:proofErr w:type="spellStart"/>
-      <w:r>
-        <w:t>Σελίδ</w:t>
-      </w:r>
-      <w:proofErr w:type="spellEnd"/>
-      <w:r>
-        <w:t>α B</w:t>
-      </w:r>
-      <w:r>
-        <w:br/>
-        <w:t xml:space="preserve">• Και </w:t>
-      </w:r>
-      <w:proofErr w:type="spellStart"/>
-      <w:r>
-        <w:t>οι</w:t>
-      </w:r>
-      <w:proofErr w:type="spellEnd"/>
-      <w:r>
-        <w:t xml:space="preserve"> </w:t>
-      </w:r>
-      <w:proofErr w:type="spellStart"/>
-      <w:r>
-        <w:t>δύο</w:t>
-      </w:r>
-      <w:proofErr w:type="spellEnd"/>
-      <w:r>
-        <w:t xml:space="preserve"> </w:t>
-      </w:r>
-      <w:proofErr w:type="spellStart"/>
-      <w:r>
-        <w:t>εξίσου</w:t>
-      </w:r>
-      <w:proofErr w:type="spellEnd"/>
+        <w:rPr>
+          <w:lang w:val="en-GB"/>
+        </w:rPr>
+      </w:pPr>
     </w:p>
+    <w:p/>
+    <w:p/>
     <w:p>
-      <w:pPr>
-        <w:pStyle w:val="ListParagraph"/>
-        <w:numPr>
-          <w:ilvl w:val="0"/>
-          <w:numId w:val="15"/>
-        </w:numPr>
-      </w:pPr>
-      <w:r>
-        <w:t>Ποια σελίδα θα προτιμούσατε να χρησιμοποιείτε στην πραγματική ζωή;</w:t>
-      </w:r>
-      <w:r>
-        <w:br/>
-      </w:r>
-      <w:r>
-        <w:t xml:space="preserve">• </w:t>
-      </w:r>
-      <w:proofErr w:type="spellStart"/>
-      <w:r>
-        <w:t>Σελίδ</w:t>
-      </w:r>
-      <w:proofErr w:type="spellEnd"/>
-      <w:r>
-        <w:t>α A</w:t>
-      </w:r>
-      <w:r>
-        <w:br/>
-        <w:t xml:space="preserve">• </w:t>
-      </w:r>
-      <w:proofErr w:type="spellStart"/>
-      <w:r>
-        <w:t>Σελίδ</w:t>
-      </w:r>
-      <w:proofErr w:type="spellEnd"/>
-      <w:r>
-        <w:t>α B</w:t>
-      </w:r>
-      <w:r>
-        <w:br/>
-        <w:t>• Καμία προτίμηση</w:t>
+      <w:r>
+        <w:t>https://docs.google.com/forms/d/e/1FAIpQLSfV_HaWYzY9uJfLCzJVlWXqGVnNGTbR16eCgLldha3Wv7YESQ/viewform?usp=publish-editor</w:t>
       </w:r>
     </w:p>
+    <w:p/>
     <w:p>
-      <w:pPr>
-        <w:pStyle w:val="ListParagraph"/>
-      </w:pPr>
-    </w:p>
-    <w:p>
-      <w:pPr>
-        <w:pStyle w:val="ListParagraph"/>
-        <w:numPr>
-          <w:ilvl w:val="0"/>
-          <w:numId w:val="15"/>
-        </w:numPr>
-        <w:rPr>
-          <w:lang w:val="en-GB"/>
-        </w:rPr>
-      </w:pPr>
-      <w:r>
-        <w:t>Προτάσεις βελτίωσης για σελίδα 1</w:t>
-      </w:r>
-    </w:p>
-    <w:p>
-      <w:pPr>
-        <w:pStyle w:val="ListParagraph"/>
-      </w:pPr>
-    </w:p>
-    <w:p>
-      <w:pPr>
-        <w:pStyle w:val="ListParagraph"/>
-        <w:numPr>
-          <w:ilvl w:val="0"/>
-          <w:numId w:val="15"/>
-        </w:numPr>
-        <w:rPr>
-          <w:lang w:val="en-GB"/>
-        </w:rPr>
-      </w:pPr>
-      <w:r>
-        <w:t xml:space="preserve">Προτάσεις βελτίωσης για σελίδα </w:t>
-      </w:r>
-      <w:r>
-        <w:t>2</w:t>
+      <w:r>
+        <w:rPr>
+          <w:noProof/>
+        </w:rPr>
+        <mc:AlternateContent>
+          <mc:Choice Requires="wps">
+            <w:drawing>
+              <wp:anchor distT="0" distB="0" distL="114300" distR="114300" simplePos="0" relativeHeight="251673600" behindDoc="0" locked="0" layoutInCell="1" allowOverlap="1" wp14:anchorId="727716BD" wp14:editId="7C69077D">
+                <wp:simplePos x="0" y="0"/>
+                <wp:positionH relativeFrom="column">
+                  <wp:posOffset>1765464</wp:posOffset>
+                </wp:positionH>
+                <wp:positionV relativeFrom="paragraph">
+                  <wp:posOffset>5243226</wp:posOffset>
+                </wp:positionV>
+                <wp:extent cx="1440000" cy="720000"/>
+                <wp:effectExtent l="0" t="0" r="8255" b="4445"/>
+                <wp:wrapNone/>
+                <wp:docPr id="335502576" name="Rectangle 1"/>
+                <wp:cNvGraphicFramePr>
+                  <a:graphicFrameLocks xmlns:a="http://schemas.openxmlformats.org/drawingml/2006/main" noChangeAspect="1"/>
+                </wp:cNvGraphicFramePr>
+                <a:graphic xmlns:a="http://schemas.openxmlformats.org/drawingml/2006/main">
+                  <a:graphicData uri="http://schemas.microsoft.com/office/word/2010/wordprocessingShape">
+                    <wps:wsp>
+                      <wps:cNvSpPr>
+                        <a:spLocks noChangeAspect="1"/>
+                      </wps:cNvSpPr>
+                      <wps:spPr>
+                        <a:xfrm>
+                          <a:off x="0" y="0"/>
+                          <a:ext cx="1440000" cy="720000"/>
+                        </a:xfrm>
+                        <a:prstGeom prst="rect">
+                          <a:avLst/>
+                        </a:prstGeom>
+                        <a:solidFill>
+                          <a:srgbClr val="CDCDCD"/>
+                        </a:solidFill>
+                        <a:ln>
+                          <a:noFill/>
+                        </a:ln>
+                      </wps:spPr>
+                      <wps:style>
+                        <a:lnRef idx="2">
+                          <a:schemeClr val="accent1">
+                            <a:shade val="15000"/>
+                          </a:schemeClr>
+                        </a:lnRef>
+                        <a:fillRef idx="1">
+                          <a:schemeClr val="accent1"/>
+                        </a:fillRef>
+                        <a:effectRef idx="0">
+                          <a:schemeClr val="accent1"/>
+                        </a:effectRef>
+                        <a:fontRef idx="minor">
+                          <a:schemeClr val="lt1"/>
+                        </a:fontRef>
+                      </wps:style>
+                      <wps:bodyPr rot="0" spcFirstLastPara="0" vertOverflow="overflow" horzOverflow="overflow" vert="horz" wrap="square" lIns="91440" tIns="45720" rIns="91440" bIns="45720" numCol="1" spcCol="0" rtlCol="0" fromWordArt="0" anchor="ctr" anchorCtr="0" forceAA="0" compatLnSpc="1">
+                        <a:prstTxWarp prst="textNoShape">
+                          <a:avLst/>
+                        </a:prstTxWarp>
+                        <a:noAutofit/>
+                      </wps:bodyPr>
+                    </wps:wsp>
+                  </a:graphicData>
+                </a:graphic>
+                <wp14:sizeRelH relativeFrom="margin">
+                  <wp14:pctWidth>0</wp14:pctWidth>
+                </wp14:sizeRelH>
+                <wp14:sizeRelV relativeFrom="margin">
+                  <wp14:pctHeight>0</wp14:pctHeight>
+                </wp14:sizeRelV>
+              </wp:anchor>
+            </w:drawing>
+          </mc:Choice>
+          <mc:Fallback>
+            <w:pict>
+              <v:rect w14:anchorId="0DDC987B" id="Rectangle 1" o:spid="_x0000_s1026" style="position:absolute;margin-left:139pt;margin-top:412.85pt;width:113.4pt;height:56.7pt;z-index:251673600;visibility:visible;mso-wrap-style:square;mso-width-percent:0;mso-height-percent:0;mso-wrap-distance-left:9pt;mso-wrap-distance-top:0;mso-wrap-distance-right:9pt;mso-wrap-distance-bottom:0;mso-position-horizontal:absolute;mso-position-horizontal-relative:text;mso-position-vertical:absolute;mso-position-vertical-relative:text;mso-width-percent:0;mso-height-percent:0;mso-width-relative:margin;mso-height-relative:margin;v-text-anchor:middle" o:gfxdata="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" fillcolor="#cdcdcd" stroked="f" strokeweight="1pt">
+                <o:lock v:ext="edit" aspectratio="t"/>
+              </v:rect>
+            </w:pict>
+          </mc:Fallback>
+        </mc:AlternateContent>
+      </w:r>
+      <w:r>
+        <w:rPr>
+          <w:noProof/>
+        </w:rPr>
+        <mc:AlternateContent>
+          <mc:Choice Requires="wps">
+            <w:drawing>
+              <wp:anchor distT="0" distB="0" distL="114300" distR="114300" simplePos="0" relativeHeight="251667456" behindDoc="0" locked="0" layoutInCell="1" allowOverlap="1" wp14:anchorId="607AC07C" wp14:editId="59C267CC">
+                <wp:simplePos x="0" y="0"/>
+                <wp:positionH relativeFrom="column">
+                  <wp:posOffset>1773555</wp:posOffset>
+                </wp:positionH>
+                <wp:positionV relativeFrom="paragraph">
+                  <wp:posOffset>3800792</wp:posOffset>
+                </wp:positionV>
+                <wp:extent cx="1440000" cy="720000"/>
+                <wp:effectExtent l="0" t="0" r="8255" b="4445"/>
+                <wp:wrapNone/>
+                <wp:docPr id="628192389" name="Rectangle 1"/>
+                <wp:cNvGraphicFramePr>
+                  <a:graphicFrameLocks xmlns:a="http://schemas.openxmlformats.org/drawingml/2006/main" noChangeAspect="1"/>
+                </wp:cNvGraphicFramePr>
+                <a:graphic xmlns:a="http://schemas.openxmlformats.org/drawingml/2006/main">
+                  <a:graphicData uri="http://schemas.microsoft.com/office/word/2010/wordprocessingShape">
+                    <wps:wsp>
+                      <wps:cNvSpPr>
+                        <a:spLocks noChangeAspect="1"/>
+                      </wps:cNvSpPr>
+                      <wps:spPr>
+                        <a:xfrm>
+                          <a:off x="0" y="0"/>
+                          <a:ext cx="1440000" cy="720000"/>
+                        </a:xfrm>
+                        <a:prstGeom prst="rect">
+                          <a:avLst/>
+                        </a:prstGeom>
+                        <a:solidFill>
+                          <a:srgbClr val="262626"/>
+                        </a:solidFill>
+                        <a:ln>
+                          <a:noFill/>
+                        </a:ln>
+                      </wps:spPr>
+                      <wps:style>
+                        <a:lnRef idx="2">
+                          <a:schemeClr val="accent1">
+                            <a:shade val="15000"/>
+                          </a:schemeClr>
+                        </a:lnRef>
+                        <a:fillRef idx="1">
+                          <a:schemeClr val="accent1"/>
+                        </a:fillRef>
+                        <a:effectRef idx="0">
+                          <a:schemeClr val="accent1"/>
+                        </a:effectRef>
+                        <a:fontRef idx="minor">
+                          <a:schemeClr val="lt1"/>
+                        </a:fontRef>
+                      </wps:style>
+                      <wps:bodyPr rot="0" spcFirstLastPara="0" vertOverflow="overflow" horzOverflow="overflow" vert="horz" wrap="square" lIns="91440" tIns="45720" rIns="91440" bIns="45720" numCol="1" spcCol="0" rtlCol="0" fromWordArt="0" anchor="ctr" anchorCtr="0" forceAA="0" compatLnSpc="1">
+                        <a:prstTxWarp prst="textNoShape">
+                          <a:avLst/>
+                        </a:prstTxWarp>
+                        <a:noAutofit/>
+                      </wps:bodyPr>
+                    </wps:wsp>
+                  </a:graphicData>
+                </a:graphic>
+                <wp14:sizeRelH relativeFrom="margin">
+                  <wp14:pctWidth>0</wp14:pctWidth>
+                </wp14:sizeRelH>
+                <wp14:sizeRelV relativeFrom="margin">
+                  <wp14:pctHeight>0</wp14:pctHeight>
+                </wp14:sizeRelV>
+              </wp:anchor>
+            </w:drawing>
+          </mc:Choice>
+          <mc:Fallback>
+            <w:pict>
+              <v:rect w14:anchorId="5392F0CC" id="Rectangle 1" o:spid="_x0000_s1026" style="position:absolute;margin-left:139.65pt;margin-top:299.25pt;width:113.4pt;height:56.7pt;z-index:251667456;visibility:visible;mso-wrap-style:square;mso-width-percent:0;mso-height-percent:0;mso-wrap-distance-left:9pt;mso-wrap-distance-top:0;mso-wrap-distance-right:9pt;mso-wrap-distance-bottom:0;mso-position-horizontal:absolute;mso-position-horizontal-relative:text;mso-position-vertical:absolute;mso-position-vertical-relative:text;mso-width-percent:0;mso-height-percent:0;mso-width-relative:margin;mso-height-relative:margin;v-text-anchor:middle" o:gfxdata="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" fillcolor="#262626" stroked="f" strokeweight="1pt">
+                <o:lock v:ext="edit" aspectratio="t"/>
+              </v:rect>
+            </w:pict>
+          </mc:Fallback>
+        </mc:AlternateContent>
+      </w:r>
+      <w:r>
+        <w:rPr>
+          <w:noProof/>
+        </w:rPr>
+        <mc:AlternateContent>
+          <mc:Choice Requires="wps">
+            <w:drawing>
+              <wp:anchor distT="0" distB="0" distL="114300" distR="114300" simplePos="0" relativeHeight="251669504" behindDoc="0" locked="0" layoutInCell="1" allowOverlap="1" wp14:anchorId="6FBCF8B5" wp14:editId="074109E3">
+                <wp:simplePos x="0" y="0"/>
+                <wp:positionH relativeFrom="column">
+                  <wp:posOffset>1051878</wp:posOffset>
+                </wp:positionH>
+                <wp:positionV relativeFrom="paragraph">
+                  <wp:posOffset>4521200</wp:posOffset>
+                </wp:positionV>
+                <wp:extent cx="1440000" cy="720000"/>
+                <wp:effectExtent l="0" t="0" r="8255" b="4445"/>
+                <wp:wrapNone/>
+                <wp:docPr id="1852190448" name="Rectangle 1"/>
+                <wp:cNvGraphicFramePr>
+                  <a:graphicFrameLocks xmlns:a="http://schemas.openxmlformats.org/drawingml/2006/main" noChangeAspect="1"/>
+                </wp:cNvGraphicFramePr>
+                <a:graphic xmlns:a="http://schemas.openxmlformats.org/drawingml/2006/main">
+                  <a:graphicData uri="http://schemas.microsoft.com/office/word/2010/wordprocessingShape">
+                    <wps:wsp>
+                      <wps:cNvSpPr>
+                        <a:spLocks noChangeAspect="1"/>
+                      </wps:cNvSpPr>
+                      <wps:spPr>
+                        <a:xfrm>
+                          <a:off x="0" y="0"/>
+                          <a:ext cx="1440000" cy="720000"/>
+                        </a:xfrm>
+                        <a:prstGeom prst="rect">
+                          <a:avLst/>
+                        </a:prstGeom>
+                        <a:solidFill>
+                          <a:srgbClr val="B341D3"/>
+                        </a:solidFill>
+                        <a:ln>
+                          <a:noFill/>
+                        </a:ln>
+                      </wps:spPr>
+                      <wps:style>
+                        <a:lnRef idx="2">
+                          <a:schemeClr val="accent1">
+                            <a:shade val="15000"/>
+                          </a:schemeClr>
+                        </a:lnRef>
+                        <a:fillRef idx="1">
+                          <a:schemeClr val="accent1"/>
+                        </a:fillRef>
+                        <a:effectRef idx="0">
+                          <a:schemeClr val="accent1"/>
+                        </a:effectRef>
+                        <a:fontRef idx="minor">
+                          <a:schemeClr val="lt1"/>
+                        </a:fontRef>
+                      </wps:style>
+                      <wps:bodyPr rot="0" spcFirstLastPara="0" vertOverflow="overflow" horzOverflow="overflow" vert="horz" wrap="square" lIns="91440" tIns="45720" rIns="91440" bIns="45720" numCol="1" spcCol="0" rtlCol="0" fromWordArt="0" anchor="ctr" anchorCtr="0" forceAA="0" compatLnSpc="1">
+                        <a:prstTxWarp prst="textNoShape">
+                          <a:avLst/>
+                        </a:prstTxWarp>
+                        <a:noAutofit/>
+                      </wps:bodyPr>
+                    </wps:wsp>
+                  </a:graphicData>
+                </a:graphic>
+                <wp14:sizeRelH relativeFrom="margin">
+                  <wp14:pctWidth>0</wp14:pctWidth>
+                </wp14:sizeRelH>
+                <wp14:sizeRelV relativeFrom="margin">
+                  <wp14:pctHeight>0</wp14:pctHeight>
+                </wp14:sizeRelV>
+              </wp:anchor>
+            </w:drawing>
+          </mc:Choice>
+          <mc:Fallback>
+            <w:pict>
+              <v:rect w14:anchorId="4AD139C6" id="Rectangle 1" o:spid="_x0000_s1026" style="position:absolute;margin-left:82.85pt;margin-top:356pt;width:113.4pt;height:56.7pt;z-index:251669504;visibility:visible;mso-wrap-style:square;mso-width-percent:0;mso-height-percent:0;mso-wrap-distance-left:9pt;mso-wrap-distance-top:0;mso-wrap-distance-right:9pt;mso-wrap-distance-bottom:0;mso-position-horizontal:absolute;mso-position-horizontal-relative:text;mso-position-vertical:absolute;mso-position-vertical-relative:text;mso-width-percent:0;mso-height-percent:0;mso-width-relative:margin;mso-height-relative:margin;v-text-anchor:middle" o:gfxdata="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" fillcolor="#b341d3" stroked="f" strokeweight="1pt">
+                <o:lock v:ext="edit" aspectratio="t"/>
+              </v:rect>
+            </w:pict>
+          </mc:Fallback>
+        </mc:AlternateContent>
+      </w:r>
+      <w:r>
+        <w:rPr>
+          <w:noProof/>
+        </w:rPr>
+        <mc:AlternateContent>
+          <mc:Choice Requires="wps">
+            <w:drawing>
+              <wp:anchor distT="0" distB="0" distL="114300" distR="114300" simplePos="0" relativeHeight="251671552" behindDoc="0" locked="0" layoutInCell="1" allowOverlap="1" wp14:anchorId="69CEACD0" wp14:editId="2FC4F79F">
+                <wp:simplePos x="0" y="0"/>
+                <wp:positionH relativeFrom="column">
+                  <wp:posOffset>2491113</wp:posOffset>
+                </wp:positionH>
+                <wp:positionV relativeFrom="paragraph">
+                  <wp:posOffset>4520961</wp:posOffset>
+                </wp:positionV>
+                <wp:extent cx="1440000" cy="720000"/>
+                <wp:effectExtent l="0" t="0" r="8255" b="4445"/>
+                <wp:wrapNone/>
+                <wp:docPr id="1240073029" name="Rectangle 1"/>
+                <wp:cNvGraphicFramePr>
+                  <a:graphicFrameLocks xmlns:a="http://schemas.openxmlformats.org/drawingml/2006/main" noChangeAspect="1"/>
+                </wp:cNvGraphicFramePr>
+                <a:graphic xmlns:a="http://schemas.openxmlformats.org/drawingml/2006/main">
+                  <a:graphicData uri="http://schemas.microsoft.com/office/word/2010/wordprocessingShape">
+                    <wps:wsp>
+                      <wps:cNvSpPr>
+                        <a:spLocks noChangeAspect="1"/>
+                      </wps:cNvSpPr>
+                      <wps:spPr>
+                        <a:xfrm>
+                          <a:off x="0" y="0"/>
+                          <a:ext cx="1440000" cy="720000"/>
+                        </a:xfrm>
+                        <a:prstGeom prst="rect">
+                          <a:avLst/>
+                        </a:prstGeom>
+                        <a:solidFill>
+                          <a:srgbClr val="2DC9C4"/>
+                        </a:solidFill>
+                        <a:ln>
+                          <a:noFill/>
+                        </a:ln>
+                      </wps:spPr>
+                      <wps:style>
+                        <a:lnRef idx="2">
+                          <a:schemeClr val="accent1">
+                            <a:shade val="15000"/>
+                          </a:schemeClr>
+                        </a:lnRef>
+                        <a:fillRef idx="1">
+                          <a:schemeClr val="accent1"/>
+                        </a:fillRef>
+                        <a:effectRef idx="0">
+                          <a:schemeClr val="accent1"/>
+                        </a:effectRef>
+                        <a:fontRef idx="minor">
+                          <a:schemeClr val="lt1"/>
+                        </a:fontRef>
+                      </wps:style>
+                      <wps:bodyPr rot="0" spcFirstLastPara="0" vertOverflow="overflow" horzOverflow="overflow" vert="horz" wrap="square" lIns="91440" tIns="45720" rIns="91440" bIns="45720" numCol="1" spcCol="0" rtlCol="0" fromWordArt="0" anchor="ctr" anchorCtr="0" forceAA="0" compatLnSpc="1">
+                        <a:prstTxWarp prst="textNoShape">
+                          <a:avLst/>
+                        </a:prstTxWarp>
+                        <a:noAutofit/>
+                      </wps:bodyPr>
+                    </wps:wsp>
+                  </a:graphicData>
+                </a:graphic>
+                <wp14:sizeRelH relativeFrom="margin">
+                  <wp14:pctWidth>0</wp14:pctWidth>
+                </wp14:sizeRelH>
+                <wp14:sizeRelV relativeFrom="margin">
+                  <wp14:pctHeight>0</wp14:pctHeight>
+                </wp14:sizeRelV>
+              </wp:anchor>
+            </w:drawing>
+          </mc:Choice>
+          <mc:Fallback>
+            <w:pict>
+              <v:rect w14:anchorId="45CC6618" id="Rectangle 1" o:spid="_x0000_s1026" style="position:absolute;margin-left:196.15pt;margin-top:356pt;width:113.4pt;height:56.7pt;z-index:251671552;visibility:visible;mso-wrap-style:square;mso-width-percent:0;mso-height-percent:0;mso-wrap-distance-left:9pt;mso-wrap-distance-top:0;mso-wrap-distance-right:9pt;mso-wrap-distance-bottom:0;mso-position-horizontal:absolute;mso-position-horizontal-relative:text;mso-position-vertical:absolute;mso-position-vertical-relative:text;mso-width-percent:0;mso-height-percent:0;mso-width-relative:margin;mso-height-relative:margin;v-text-anchor:middle" o:gfxdata="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" fillcolor="#2dc9c4" stroked="f" strokeweight="1pt">
+                <o:lock v:ext="edit" aspectratio="t"/>
+              </v:rect>
+            </w:pict>
+          </mc:Fallback>
+        </mc:AlternateContent>
+      </w:r>
+      <w:r>
+        <w:rPr>
+          <w:noProof/>
+        </w:rPr>
+        <mc:AlternateContent>
+          <mc:Choice Requires="wps">
+            <w:drawing>
+              <wp:anchor distT="0" distB="0" distL="114300" distR="114300" simplePos="0" relativeHeight="251665408" behindDoc="0" locked="0" layoutInCell="1" allowOverlap="1" wp14:anchorId="308E1D78" wp14:editId="0025FEF1">
+                <wp:simplePos x="0" y="0"/>
+                <wp:positionH relativeFrom="column">
+                  <wp:posOffset>1854612</wp:posOffset>
+                </wp:positionH>
+                <wp:positionV relativeFrom="paragraph">
+                  <wp:posOffset>2008316</wp:posOffset>
+                </wp:positionV>
+                <wp:extent cx="1440000" cy="720000"/>
+                <wp:effectExtent l="0" t="0" r="8255" b="4445"/>
+                <wp:wrapNone/>
+                <wp:docPr id="1203928646" name="Rectangle 1"/>
+                <wp:cNvGraphicFramePr>
+                  <a:graphicFrameLocks xmlns:a="http://schemas.openxmlformats.org/drawingml/2006/main" noChangeAspect="1"/>
+                </wp:cNvGraphicFramePr>
+                <a:graphic xmlns:a="http://schemas.openxmlformats.org/drawingml/2006/main">
+                  <a:graphicData uri="http://schemas.microsoft.com/office/word/2010/wordprocessingShape">
+                    <wps:wsp>
+                      <wps:cNvSpPr>
+                        <a:spLocks noChangeAspect="1"/>
+                      </wps:cNvSpPr>
+                      <wps:spPr>
+                        <a:xfrm>
+                          <a:off x="0" y="0"/>
+                          <a:ext cx="1440000" cy="720000"/>
+                        </a:xfrm>
+                        <a:prstGeom prst="rect">
+                          <a:avLst/>
+                        </a:prstGeom>
+                        <a:solidFill>
+                          <a:srgbClr val="1D1D1D"/>
+                        </a:solidFill>
+                        <a:ln>
+                          <a:noFill/>
+                        </a:ln>
+                      </wps:spPr>
+                      <wps:style>
+                        <a:lnRef idx="2">
+                          <a:schemeClr val="accent1">
+                            <a:shade val="15000"/>
+                          </a:schemeClr>
+                        </a:lnRef>
+                        <a:fillRef idx="1">
+                          <a:schemeClr val="accent1"/>
+                        </a:fillRef>
+                        <a:effectRef idx="0">
+                          <a:schemeClr val="accent1"/>
+                        </a:effectRef>
+                        <a:fontRef idx="minor">
+                          <a:schemeClr val="lt1"/>
+                        </a:fontRef>
+                      </wps:style>
+                      <wps:bodyPr rot="0" spcFirstLastPara="0" vertOverflow="overflow" horzOverflow="overflow" vert="horz" wrap="square" lIns="91440" tIns="45720" rIns="91440" bIns="45720" numCol="1" spcCol="0" rtlCol="0" fromWordArt="0" anchor="ctr" anchorCtr="0" forceAA="0" compatLnSpc="1">
+                        <a:prstTxWarp prst="textNoShape">
+                          <a:avLst/>
+                        </a:prstTxWarp>
+                        <a:noAutofit/>
+                      </wps:bodyPr>
+                    </wps:wsp>
+                  </a:graphicData>
+                </a:graphic>
+                <wp14:sizeRelH relativeFrom="margin">
+                  <wp14:pctWidth>0</wp14:pctWidth>
+                </wp14:sizeRelH>
+                <wp14:sizeRelV relativeFrom="margin">
+                  <wp14:pctHeight>0</wp14:pctHeight>
+                </wp14:sizeRelV>
+              </wp:anchor>
+            </w:drawing>
+          </mc:Choice>
+          <mc:Fallback>
+            <w:pict>
+              <v:rect w14:anchorId="5A1C5B7A" id="Rectangle 1" o:spid="_x0000_s1026" style="position:absolute;margin-left:146.05pt;margin-top:158.15pt;width:113.4pt;height:56.7pt;z-index:251665408;visibility:visible;mso-wrap-style:square;mso-width-percent:0;mso-height-percent:0;mso-wrap-distance-left:9pt;mso-wrap-distance-top:0;mso-wrap-distance-right:9pt;mso-wrap-distance-bottom:0;mso-position-horizontal:absolute;mso-position-horizontal-relative:text;mso-position-vertical:absolute;mso-position-vertical-relative:text;mso-width-percent:0;mso-height-percent:0;mso-width-relative:margin;mso-height-relative:margin;v-text-anchor:middle" o:gfxdata="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" fillcolor="#1d1d1d" stroked="f" strokeweight="1pt">
+                <o:lock v:ext="edit" aspectratio="t"/>
+              </v:rect>
+            </w:pict>
+          </mc:Fallback>
+        </mc:AlternateContent>
+      </w:r>
+      <w:r>
+        <w:rPr>
+          <w:noProof/>
+        </w:rPr>
+        <mc:AlternateContent>
+          <mc:Choice Requires="wps">
+            <w:drawing>
+              <wp:anchor distT="0" distB="0" distL="114300" distR="114300" simplePos="0" relativeHeight="251659264" behindDoc="0" locked="0" layoutInCell="1" allowOverlap="1" wp14:anchorId="4996F7DD" wp14:editId="7A71B99E">
+                <wp:simplePos x="0" y="0"/>
+                <wp:positionH relativeFrom="column">
+                  <wp:posOffset>1845813</wp:posOffset>
+                </wp:positionH>
+                <wp:positionV relativeFrom="paragraph">
+                  <wp:posOffset>575006</wp:posOffset>
+                </wp:positionV>
+                <wp:extent cx="1440000" cy="720000"/>
+                <wp:effectExtent l="0" t="0" r="8255" b="4445"/>
+                <wp:wrapNone/>
+                <wp:docPr id="106220852" name="Rectangle 1"/>
+                <wp:cNvGraphicFramePr>
+                  <a:graphicFrameLocks xmlns:a="http://schemas.openxmlformats.org/drawingml/2006/main" noChangeAspect="1"/>
+                </wp:cNvGraphicFramePr>
+                <a:graphic xmlns:a="http://schemas.openxmlformats.org/drawingml/2006/main">
+                  <a:graphicData uri="http://schemas.microsoft.com/office/word/2010/wordprocessingShape">
+                    <wps:wsp>
+                      <wps:cNvSpPr>
+                        <a:spLocks noChangeAspect="1"/>
+                      </wps:cNvSpPr>
+                      <wps:spPr>
+                        <a:xfrm>
+                          <a:off x="0" y="0"/>
+                          <a:ext cx="1440000" cy="720000"/>
+                        </a:xfrm>
+                        <a:prstGeom prst="rect">
+                          <a:avLst/>
+                        </a:prstGeom>
+                        <a:solidFill>
+                          <a:srgbClr val="2563EB"/>
+                        </a:solidFill>
+                        <a:ln>
+                          <a:noFill/>
+                        </a:ln>
+                      </wps:spPr>
+                      <wps:style>
+                        <a:lnRef idx="2">
+                          <a:schemeClr val="accent1">
+                            <a:shade val="15000"/>
+                          </a:schemeClr>
+                        </a:lnRef>
+                        <a:fillRef idx="1">
+                          <a:schemeClr val="accent1"/>
+                        </a:fillRef>
+                        <a:effectRef idx="0">
+                          <a:schemeClr val="accent1"/>
+                        </a:effectRef>
+                        <a:fontRef idx="minor">
+                          <a:schemeClr val="lt1"/>
+                        </a:fontRef>
+                      </wps:style>
+                      <wps:bodyPr rot="0" spcFirstLastPara="0" vertOverflow="overflow" horzOverflow="overflow" vert="horz" wrap="square" lIns="91440" tIns="45720" rIns="91440" bIns="45720" numCol="1" spcCol="0" rtlCol="0" fromWordArt="0" anchor="ctr" anchorCtr="0" forceAA="0" compatLnSpc="1">
+                        <a:prstTxWarp prst="textNoShape">
+                          <a:avLst/>
+                        </a:prstTxWarp>
+                        <a:noAutofit/>
+                      </wps:bodyPr>
+                    </wps:wsp>
+                  </a:graphicData>
+                </a:graphic>
+                <wp14:sizeRelH relativeFrom="margin">
+                  <wp14:pctWidth>0</wp14:pctWidth>
+                </wp14:sizeRelH>
+                <wp14:sizeRelV relativeFrom="margin">
+                  <wp14:pctHeight>0</wp14:pctHeight>
+                </wp14:sizeRelV>
+              </wp:anchor>
+            </w:drawing>
+          </mc:Choice>
+          <mc:Fallback>
+            <w:pict>
+              <v:rect w14:anchorId="4C34E7CD" id="Rectangle 1" o:spid="_x0000_s1026" style="position:absolute;margin-left:145.35pt;margin-top:45.3pt;width:113.4pt;height:56.7pt;z-index:251659264;visibility:visible;mso-wrap-style:square;mso-width-percent:0;mso-height-percent:0;mso-wrap-distance-left:9pt;mso-wrap-distance-top:0;mso-wrap-distance-right:9pt;mso-wrap-distance-bottom:0;mso-position-horizontal:absolute;mso-position-horizontal-relative:text;mso-position-vertical:absolute;mso-position-vertical-relative:text;mso-width-percent:0;mso-height-percent:0;mso-width-relative:margin;mso-height-relative:margin;v-text-anchor:middle" o:gfxdata="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" fillcolor="#2563eb" stroked="f" strokeweight="1pt">
+                <o:lock v:ext="edit" aspectratio="t"/>
+              </v:rect>
+            </w:pict>
+          </mc:Fallback>
+        </mc:AlternateContent>
+      </w:r>
+      <w:r>
+        <w:rPr>
+          <w:noProof/>
+        </w:rPr>
+        <mc:AlternateContent>
+          <mc:Choice Requires="wps">
+            <w:drawing>
+              <wp:anchor distT="0" distB="0" distL="114300" distR="114300" simplePos="0" relativeHeight="251663360" behindDoc="0" locked="0" layoutInCell="1" allowOverlap="1" wp14:anchorId="1F3B22A8" wp14:editId="65D06ACD">
+                <wp:simplePos x="0" y="0"/>
+                <wp:positionH relativeFrom="column">
+                  <wp:posOffset>1134110</wp:posOffset>
+                </wp:positionH>
+                <wp:positionV relativeFrom="paragraph">
+                  <wp:posOffset>1292225</wp:posOffset>
+                </wp:positionV>
+                <wp:extent cx="1439545" cy="719455"/>
+                <wp:effectExtent l="0" t="0" r="8255" b="4445"/>
+                <wp:wrapNone/>
+                <wp:docPr id="366849650" name="Rectangle 1"/>
+                <wp:cNvGraphicFramePr>
+                  <a:graphicFrameLocks xmlns:a="http://schemas.openxmlformats.org/drawingml/2006/main" noChangeAspect="1"/>
+                </wp:cNvGraphicFramePr>
+                <a:graphic xmlns:a="http://schemas.openxmlformats.org/drawingml/2006/main">
+                  <a:graphicData uri="http://schemas.microsoft.com/office/word/2010/wordprocessingShape">
+                    <wps:wsp>
+                      <wps:cNvSpPr>
+                        <a:spLocks noChangeAspect="1"/>
+                      </wps:cNvSpPr>
+                      <wps:spPr>
+                        <a:xfrm>
+                          <a:off x="0" y="0"/>
+                          <a:ext cx="1439545" cy="719455"/>
+                        </a:xfrm>
+                        <a:prstGeom prst="rect">
+                          <a:avLst/>
+                        </a:prstGeom>
+                        <a:solidFill>
+                          <a:srgbClr val="D9D9D9"/>
+                        </a:solidFill>
+                        <a:ln>
+                          <a:noFill/>
+                        </a:ln>
+                      </wps:spPr>
+                      <wps:style>
+                        <a:lnRef idx="2">
+                          <a:schemeClr val="accent1">
+                            <a:shade val="15000"/>
+                          </a:schemeClr>
+                        </a:lnRef>
+                        <a:fillRef idx="1">
+                          <a:schemeClr val="accent1"/>
+                        </a:fillRef>
+                        <a:effectRef idx="0">
+                          <a:schemeClr val="accent1"/>
+                        </a:effectRef>
+                        <a:fontRef idx="minor">
+                          <a:schemeClr val="lt1"/>
+                        </a:fontRef>
+                      </wps:style>
+                      <wps:bodyPr rot="0" spcFirstLastPara="0" vertOverflow="overflow" horzOverflow="overflow" vert="horz" wrap="square" lIns="91440" tIns="45720" rIns="91440" bIns="45720" numCol="1" spcCol="0" rtlCol="0" fromWordArt="0" anchor="ctr" anchorCtr="0" forceAA="0" compatLnSpc="1">
+                        <a:prstTxWarp prst="textNoShape">
+                          <a:avLst/>
+                        </a:prstTxWarp>
+                        <a:noAutofit/>
+                      </wps:bodyPr>
+                    </wps:wsp>
+                  </a:graphicData>
+                </a:graphic>
+                <wp14:sizeRelH relativeFrom="margin">
+                  <wp14:pctWidth>0</wp14:pctWidth>
+                </wp14:sizeRelH>
+                <wp14:sizeRelV relativeFrom="margin">
+                  <wp14:pctHeight>0</wp14:pctHeight>
+                </wp14:sizeRelV>
+              </wp:anchor>
+            </w:drawing>
+          </mc:Choice>
+          <mc:Fallback>
+            <w:pict>
+              <v:rect w14:anchorId="71A6B0C7" id="Rectangle 1" o:spid="_x0000_s1026" style="position:absolute;margin-left:89.3pt;margin-top:101.75pt;width:113.35pt;height:56.65pt;z-index:251663360;visibility:visible;mso-wrap-style:square;mso-width-percent:0;mso-height-percent:0;mso-wrap-distance-left:9pt;mso-wrap-distance-top:0;mso-wrap-distance-right:9pt;mso-wrap-distance-bottom:0;mso-position-horizontal:absolute;mso-position-horizontal-relative:text;mso-position-vertical:absolute;mso-position-vertical-relative:text;mso-width-percent:0;mso-height-percent:0;mso-width-relative:margin;mso-height-relative:margin;v-text-anchor:middle" o:gfxdata="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" fillcolor="#d9d9d9" stroked="f" strokeweight="1pt">
+                <o:lock v:ext="edit" aspectratio="t"/>
+              </v:rect>
+            </w:pict>
+          </mc:Fallback>
+        </mc:AlternateContent>
+      </w:r>
+      <w:r>
+        <w:rPr>
+          <w:noProof/>
+        </w:rPr>
+        <mc:AlternateContent>
+          <mc:Choice Requires="wps">
+            <w:drawing>
+              <wp:anchor distT="0" distB="0" distL="114300" distR="114300" simplePos="0" relativeHeight="251661312" behindDoc="0" locked="0" layoutInCell="1" allowOverlap="1" wp14:anchorId="219B03FC" wp14:editId="61B0786D">
+                <wp:simplePos x="0" y="0"/>
+                <wp:positionH relativeFrom="column">
+                  <wp:posOffset>2565651</wp:posOffset>
+                </wp:positionH>
+                <wp:positionV relativeFrom="paragraph">
+                  <wp:posOffset>1294238</wp:posOffset>
+                </wp:positionV>
+                <wp:extent cx="1440000" cy="720000"/>
+                <wp:effectExtent l="0" t="0" r="8255" b="4445"/>
+                <wp:wrapNone/>
+                <wp:docPr id="1893615764" name="Rectangle 1"/>
+                <wp:cNvGraphicFramePr>
+                  <a:graphicFrameLocks xmlns:a="http://schemas.openxmlformats.org/drawingml/2006/main" noChangeAspect="1"/>
+                </wp:cNvGraphicFramePr>
+                <a:graphic xmlns:a="http://schemas.openxmlformats.org/drawingml/2006/main">
+                  <a:graphicData uri="http://schemas.microsoft.com/office/word/2010/wordprocessingShape">
+                    <wps:wsp>
+                      <wps:cNvSpPr>
+                        <a:spLocks noChangeAspect="1"/>
+                      </wps:cNvSpPr>
+                      <wps:spPr>
+                        <a:xfrm>
+                          <a:off x="0" y="0"/>
+                          <a:ext cx="1440000" cy="720000"/>
+                        </a:xfrm>
+                        <a:prstGeom prst="rect">
+                          <a:avLst/>
+                        </a:prstGeom>
+                        <a:solidFill>
+                          <a:srgbClr val="F2F2F2"/>
+                        </a:solidFill>
+                        <a:ln>
+                          <a:noFill/>
+                        </a:ln>
+                      </wps:spPr>
+                      <wps:style>
+                        <a:lnRef idx="2">
+                          <a:schemeClr val="accent1">
+                            <a:shade val="15000"/>
+                          </a:schemeClr>
+                        </a:lnRef>
+                        <a:fillRef idx="1">
+                          <a:schemeClr val="accent1"/>
+                        </a:fillRef>
+                        <a:effectRef idx="0">
+                          <a:schemeClr val="accent1"/>
+                        </a:effectRef>
+                        <a:fontRef idx="minor">
+                          <a:schemeClr val="lt1"/>
+                        </a:fontRef>
+                      </wps:style>
+                      <wps:bodyPr rot="0" spcFirstLastPara="0" vertOverflow="overflow" horzOverflow="overflow" vert="horz" wrap="square" lIns="91440" tIns="45720" rIns="91440" bIns="45720" numCol="1" spcCol="0" rtlCol="0" fromWordArt="0" anchor="ctr" anchorCtr="0" forceAA="0" compatLnSpc="1">
+                        <a:prstTxWarp prst="textNoShape">
+                          <a:avLst/>
+                        </a:prstTxWarp>
+                        <a:noAutofit/>
+                      </wps:bodyPr>
+                    </wps:wsp>
+                  </a:graphicData>
+                </a:graphic>
+                <wp14:sizeRelH relativeFrom="margin">
+                  <wp14:pctWidth>0</wp14:pctWidth>
+                </wp14:sizeRelH>
+                <wp14:sizeRelV relativeFrom="margin">
+                  <wp14:pctHeight>0</wp14:pctHeight>
+                </wp14:sizeRelV>
+              </wp:anchor>
+            </w:drawing>
+          </mc:Choice>
+          <mc:Fallback>
+            <w:pict>
+              <v:rect w14:anchorId="4036EE0E" id="Rectangle 1" o:spid="_x0000_s1026" style="position:absolute;margin-left:202pt;margin-top:101.9pt;width:113.4pt;height:56.7pt;z-index:251661312;visibility:visible;mso-wrap-style:square;mso-width-percent:0;mso-height-percent:0;mso-wrap-distance-left:9pt;mso-wrap-distance-top:0;mso-wrap-distance-right:9pt;mso-wrap-distance-bottom:0;mso-position-horizontal:absolute;mso-position-horizontal-relative:text;mso-position-vertical:absolute;mso-position-vertical-relative:text;mso-width-percent:0;mso-height-percent:0;mso-width-relative:margin;mso-height-relative:margin;v-text-anchor:middle" o:gfxdata="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" fillcolor="#f2f2f2" stroked="f" strokeweight="1pt">
+                <o:lock v:ext="edit" aspectratio="t"/>
+              </v:rect>
+            </w:pict>
+          </mc:Fallback>
+        </mc:AlternateContent>
       </w:r>
     </w:p>
     <w:sectPr>
@@ -1221,6 +1542,56 @@
 </w:document>
 </file>
 
+<file path=word/endnotes.xml><?xml version="1.0" encoding="utf-8"?>
+<w:endnotes xmlns:wpc="http://schemas.microsoft.com/office/word/2010/wordprocessingCanvas" xmlns:cx="http://schemas.microsoft.com/office/drawing/2014/chartex" xmlns:cx1="http://schemas.microsoft.com/office/drawing/2015/9/8/chartex" xmlns:cx2="http://schemas.microsoft.com/office/drawing/2015/10/21/chartex" xmlns:cx3="http://schemas.microsoft.com/office/drawing/2016/5/9/chartex" xmlns:cx4="http://schemas.microsoft.com/office/drawing/2016/5/10/chartex" xmlns:cx5="http://schemas.microsoft.com/office/drawing/2016/5/11/chartex" xmlns:cx6="http://schemas.microsoft.com/office/drawing/2016/5/12/chartex" xmlns:cx7="http://schemas.microsoft.com/office/drawing/2016/5/13/chartex" xmlns:cx8="http://schemas.microsoft.com/office/drawing/2016/5/14/chartex" xmlns:mc="http://schemas.openxmlformats.org/markup-compatibility/2006" xmlns:aink="http://schemas.microsoft.com/office/drawing/2016/ink" xmlns:am3d="http://schemas.microsoft.com/office/drawing/2017/model3d" xmlns:o="urn:schemas-microsoft-com:office:office" xmlns:oel="http://schemas.microsoft.com/office/2019/extlst" xmlns:r="http://schemas.openxmlformats.org/officeDocument/2006/relationships" xmlns:m="http://schemas.openxmlformats.org/officeDocument/2006/math" xmlns:v="urn:schemas-microsoft-com:vml" xmlns:wp14="http://schemas.microsoft.com/office/word/2010/wordprocessingDrawing" xmlns:wp="http://schemas.openxmlformats.org/drawingml/2006/wordprocessingDrawing" xmlns:w10="urn:schemas-microsoft-com:office:word" xmlns:w="http://schemas.openxmlformats.org/wordprocessingml/2006/main" xmlns:w14="http://schemas.microsoft.com/office/word/2010/wordml" xmlns:w15="http://schemas.microsoft.com/office/word/2012/wordml" xmlns:w16cex="http://schemas.microsoft.com/office/word/2018/wordml/cex" xmlns:w16cid="http://schemas.microsoft.com/office/word/2016/wordml/cid" xmlns:w16="http://schemas.microsoft.com/office/word/2018/wordml" xmlns:w16du="http://schemas.microsoft.com/office/word/2023/wordml/word16du" xmlns:w16sdtdh="http://schemas.microsoft.com/office/word/2020/wordml/sdtdatahash" xmlns:w16sdtfl="http://schemas.microsoft.com/office/word/2024/wordml/sdtformatlock" xmlns:w16se="http://schemas.microsoft.com/office/word/2015/wordml/symex" xmlns:wpg="http://schemas.microsoft.com/office/word/2010/wordprocessingGroup" xmlns:wpi="http://schemas.microsoft.com/office/word/2010/wordprocessingInk" xmlns:wne="http://schemas.microsoft.com/office/word/2006/wordml" xmlns:wps="http://schemas.microsoft.com/office/word/2010/wordprocessingShape" mc:Ignorable="w14 w15 w16se w16cid w16 w16cex w16sdtdh w16sdtfl w16du wp14">
+  <w:endnote w:type="separator" w:id="-1">
+    <w:p>
+      <w:pPr>
+        <w:spacing w:after="0" w:line="240" w:lineRule="auto"/>
+      </w:pPr>
+      <w:r>
+        <w:separator/>
+      </w:r>
+    </w:p>
+  </w:endnote>
+  <w:endnote w:type="continuationSeparator" w:id="0">
+    <w:p>
+      <w:pPr>
+        <w:spacing w:after="0" w:line="240" w:lineRule="auto"/>
+      </w:pPr>
+      <w:r>
+        <w:continuationSeparator/>
+      </w:r>
+    </w:p>
+  </w:endnote>
+</w:endnotes>
+</file>
+
+<file path=word/footnotes.xml><?xml version="1.0" encoding="utf-8"?>
+<w:footnotes xmlns:wpc="http://schemas.microsoft.com/office/word/2010/wordprocessingCanvas" xmlns:cx="http://schemas.microsoft.com/office/drawing/2014/chartex" xmlns:cx1="http://schemas.microsoft.com/office/drawing/2015/9/8/chartex" xmlns:cx2="http://schemas.microsoft.com/office/drawing/2015/10/21/chartex" xmlns:cx3="http://schemas.microsoft.com/office/drawing/2016/5/9/chartex" xmlns:cx4="http://schemas.microsoft.com/office/drawing/2016/5/10/chartex" xmlns:cx5="http://schemas.microsoft.com/office/drawing/2016/5/11/chartex" xmlns:cx6="http://schemas.microsoft.com/office/drawing/2016/5/12/chartex" xmlns:cx7="http://schemas.microsoft.com/office/drawing/2016/5/13/chartex" xmlns:cx8="http://schemas.microsoft.com/office/drawing/2016/5/14/chartex" xmlns:mc="http://schemas.openxmlformats.org/markup-compatibility/2006" xmlns:aink="http://schemas.microsoft.com/office/drawing/2016/ink" xmlns:am3d="http://schemas.microsoft.com/office/drawing/2017/model3d" xmlns:o="urn:schemas-microsoft-com:office:office" xmlns:oel="http://schemas.microsoft.com/office/2019/extlst" xmlns:r="http://schemas.openxmlformats.org/officeDocument/2006/relationships" xmlns:m="http://schemas.openxmlformats.org/officeDocument/2006/math" xmlns:v="urn:schemas-microsoft-com:vml" xmlns:wp14="http://schemas.microsoft.com/office/word/2010/wordprocessingDrawing" xmlns:wp="http://schemas.openxmlformats.org/drawingml/2006/wordprocessingDrawing" xmlns:w10="urn:schemas-microsoft-com:office:word" xmlns:w="http://schemas.openxmlformats.org/wordprocessingml/2006/main" xmlns:w14="http://schemas.microsoft.com/office/word/2010/wordml" xmlns:w15="http://schemas.microsoft.com/office/word/2012/wordml" xmlns:w16cex="http://schemas.microsoft.com/office/word/2018/wordml/cex" xmlns:w16cid="http://schemas.microsoft.com/office/word/2016/wordml/cid" xmlns:w16="http://schemas.microsoft.com/office/word/2018/wordml" xmlns:w16du="http://schemas.microsoft.com/office/word/2023/wordml/word16du" xmlns:w16sdtdh="http://schemas.microsoft.com/office/word/2020/wordml/sdtdatahash" xmlns:w16sdtfl="http://schemas.microsoft.com/office/word/2024/wordml/sdtformatlock" xmlns:w16se="http://schemas.microsoft.com/office/word/2015/wordml/symex" xmlns:wpg="http://schemas.microsoft.com/office/word/2010/wordprocessingGroup" xmlns:wpi="http://schemas.microsoft.com/office/word/2010/wordprocessingInk" xmlns:wne="http://schemas.microsoft.com/office/word/2006/wordml" xmlns:wps="http://schemas.microsoft.com/office/word/2010/wordprocessingShape" mc:Ignorable="w14 w15 w16se w16cid w16 w16cex w16sdtdh w16sdtfl w16du wp14">
+  <w:footnote w:type="separator" w:id="-1">
+    <w:p>
+      <w:pPr>
+        <w:spacing w:after="0" w:line="240" w:lineRule="auto"/>
+      </w:pPr>
+      <w:r>
+        <w:separator/>
+      </w:r>
+    </w:p>
+  </w:footnote>
+  <w:footnote w:type="continuationSeparator" w:id="0">
+    <w:p>
+      <w:pPr>
+        <w:spacing w:after="0" w:line="240" w:lineRule="auto"/>
+      </w:pPr>
+      <w:r>
+        <w:continuationSeparator/>
+      </w:r>
+    </w:p>
+  </w:footnote>
+</w:footnotes>
+</file>
+
 <file path=word/numbering.xml><?xml version="1.0" encoding="utf-8"?>
 <w:numbering xmlns:wpc="http://schemas.microsoft.com/office/word/2010/wordprocessingCanvas" xmlns:cx="http://schemas.microsoft.com/office/drawing/2014/chartex" xmlns:cx1="http://schemas.microsoft.com/office/drawing/2015/9/8/chartex" xmlns:cx2="http://schemas.microsoft.com/office/drawing/2015/10/21/chartex" xmlns:cx3="http://schemas.microsoft.com/office/drawing/2016/5/9/chartex" xmlns:cx4="http://schemas.microsoft.com/office/drawing/2016/5/10/chartex" xmlns:cx5="http://schemas.microsoft.com/office/drawing/2016/5/11/chartex" xmlns:cx6="http://schemas.microsoft.com/office/drawing/2016/5/12/chartex" xmlns:cx7="http://schemas.microsoft.com/office/drawing/2016/5/13/chartex" xmlns:cx8="http://schemas.microsoft.com/office/drawing/2016/5/14/chartex" xmlns:mc="http://schemas.openxmlformats.org/markup-compatibility/2006" xmlns:aink="http://schemas.microsoft.com/office/drawing/2016/ink" xmlns:am3d="http://schemas.microsoft.com/office/drawing/2017/model3d" xmlns:o="urn:schemas-microsoft-com:office:office" xmlns:oel="http://schemas.microsoft.com/office/2019/extlst" xmlns:r="http://schemas.openxmlformats.org/officeDocument/2006/relationships" xmlns:m="http://schemas.openxmlformats.org/officeDocument/2006/math" xmlns:v="urn:schemas-microsoft-com:vml" xmlns:wp14="http://schemas.microsoft.com/office/word/2010/wordprocessingDrawing" xmlns:wp="http://schemas.openxmlformats.org/drawingml/2006/wordprocessingDrawing" xmlns:w10="urn:schemas-microsoft-com:office:word" xmlns:w="http://schemas.openxmlformats.org/wordprocessingml/2006/main" xmlns:w14="http://schemas.microsoft.com/office/word/2010/wordml" xmlns:w15="http://schemas.microsoft.com/office/word/2012/wordml" xmlns:w16cex="http://schemas.microsoft.com/office/word/2018/wordml/cex" xmlns:w16cid="http://schemas.microsoft.com/office/word/2016/wordml/cid" xmlns:w16="http://schemas.microsoft.com/office/word/2018/wordml" xmlns:w16du="http://schemas.microsoft.com/office/word/2023/wordml/word16du" xmlns:w16sdtdh="http://schemas.microsoft.com/office/word/2020/wordml/sdtdatahash" xmlns:w16sdtfl="http://schemas.microsoft.com/office/word/2024/wordml/sdtformatlock" xmlns:w16se="http://schemas.microsoft.com/office/word/2015/wordml/symex" xmlns:wpg="http://schemas.microsoft.com/office/word/2010/wordprocessingGroup" xmlns:wpi="http://schemas.microsoft.com/office/word/2010/wordprocessingInk" xmlns:wne="http://schemas.microsoft.com/office/word/2006/wordml" xmlns:wps="http://schemas.microsoft.com/office/word/2010/wordprocessingShape" mc:Ignorable="w14 w15 w16se w16cid w16 w16cex w16sdtdh w16sdtfl w16du wp14">
   <w:abstractNum w:abstractNumId="0" w15:restartNumberingAfterBreak="0">
@@ -2122,6 +2493,119 @@
     </w:lvl>
   </w:abstractNum>
   <w:abstractNum w:abstractNumId="9" w15:restartNumberingAfterBreak="0">
+    <w:nsid w:val="3CDD30C5"/>
+    <w:multiLevelType w:val="hybridMultilevel"/>
+    <w:tmpl w:val="7CFEB88A"/>
+    <w:lvl w:ilvl="0" w:tplc="08090001">
+      <w:start w:val="1"/>
+      <w:numFmt w:val="bullet"/>
+      <w:lvlText w:val=""/>
+      <w:lvlJc w:val="left"/>
+      <w:pPr>
+        <w:ind w:left="1080" w:hanging="360"/>
+      </w:pPr>
+      <w:rPr>
+        <w:rFonts w:ascii="Symbol" w:hAnsi="Symbol" w:hint="default"/>
+      </w:rPr>
+    </w:lvl>
+    <w:lvl w:ilvl="1" w:tplc="08090003" w:tentative="1">
+      <w:start w:val="1"/>
+      <w:numFmt w:val="bullet"/>
+      <w:lvlText w:val="o"/>
+      <w:lvlJc w:val="left"/>
+      <w:pPr>
+        <w:ind w:left="1800" w:hanging="360"/>
+      </w:pPr>
+      <w:rPr>
+        <w:rFonts w:ascii="Courier New" w:hAnsi="Courier New" w:cs="Courier New" w:hint="default"/>
+      </w:rPr>
+    </w:lvl>
+    <w:lvl w:ilvl="2" w:tplc="08090005" w:tentative="1">
+      <w:start w:val="1"/>
+      <w:numFmt w:val="bullet"/>
+      <w:lvlText w:val=""/>
+      <w:lvlJc w:val="left"/>
+      <w:pPr>
+        <w:ind w:left="2520" w:hanging="360"/>
+      </w:pPr>
+      <w:rPr>
+        <w:rFonts w:ascii="Wingdings" w:hAnsi="Wingdings" w:hint="default"/>
+      </w:rPr>
+    </w:lvl>
+    <w:lvl w:ilvl="3" w:tplc="08090001" w:tentative="1">
+      <w:start w:val="1"/>
+      <w:numFmt w:val="bullet"/>
+      <w:lvlText w:val=""/>
+      <w:lvlJc w:val="left"/>
+      <w:pPr>
+        <w:ind w:left="3240" w:hanging="360"/>
+      </w:pPr>
+      <w:rPr>
+        <w:rFonts w:ascii="Symbol" w:hAnsi="Symbol" w:hint="default"/>
+      </w:rPr>
+    </w:lvl>
+    <w:lvl w:ilvl="4" w:tplc="08090003" w:tentative="1">
+      <w:start w:val="1"/>
+      <w:numFmt w:val="bullet"/>
+      <w:lvlText w:val="o"/>
+      <w:lvlJc w:val="left"/>
+      <w:pPr>
+        <w:ind w:left="3960" w:hanging="360"/>
+      </w:pPr>
+      <w:rPr>
+        <w:rFonts w:ascii="Courier New" w:hAnsi="Courier New" w:cs="Courier New" w:hint="default"/>
+      </w:rPr>
+    </w:lvl>
+    <w:lvl w:ilvl="5" w:tplc="08090005" w:tentative="1">
+      <w:start w:val="1"/>
+      <w:numFmt w:val="bullet"/>
+      <w:lvlText w:val=""/>
+      <w:lvlJc w:val="left"/>
+      <w:pPr>
+        <w:ind w:left="4680" w:hanging="360"/>
+      </w:pPr>
+      <w:rPr>
+        <w:rFonts w:ascii="Wingdings" w:hAnsi="Wingdings" w:hint="default"/>
+      </w:rPr>
+    </w:lvl>
+    <w:lvl w:ilvl="6" w:tplc="08090001" w:tentative="1">
+      <w:start w:val="1"/>
+      <w:numFmt w:val="bullet"/>
+      <w:lvlText w:val=""/>
+      <w:lvlJc w:val="left"/>
+      <w:pPr>
+        <w:ind w:left="5400" w:hanging="360"/>
+      </w:pPr>
+      <w:rPr>
+        <w:rFonts w:ascii="Symbol" w:hAnsi="Symbol" w:hint="default"/>
+      </w:rPr>
+    </w:lvl>
+    <w:lvl w:ilvl="7" w:tplc="08090003" w:tentative="1">
+      <w:start w:val="1"/>
+      <w:numFmt w:val="bullet"/>
+      <w:lvlText w:val="o"/>
+      <w:lvlJc w:val="left"/>
+      <w:pPr>
+        <w:ind w:left="6120" w:hanging="360"/>
+      </w:pPr>
+      <w:rPr>
+        <w:rFonts w:ascii="Courier New" w:hAnsi="Courier New" w:cs="Courier New" w:hint="default"/>
+      </w:rPr>
+    </w:lvl>
+    <w:lvl w:ilvl="8" w:tplc="08090005" w:tentative="1">
+      <w:start w:val="1"/>
+      <w:numFmt w:val="bullet"/>
+      <w:lvlText w:val=""/>
+      <w:lvlJc w:val="left"/>
+      <w:pPr>
+        <w:ind w:left="6840" w:hanging="360"/>
+      </w:pPr>
+      <w:rPr>
+        <w:rFonts w:ascii="Wingdings" w:hAnsi="Wingdings" w:hint="default"/>
+      </w:rPr>
+    </w:lvl>
+  </w:abstractNum>
+  <w:abstractNum w:abstractNumId="10" w15:restartNumberingAfterBreak="0">
     <w:nsid w:val="3DDF6198"/>
     <w:multiLevelType w:val="hybridMultilevel"/>
     <w:tmpl w:val="8ACC3036"/>
@@ -2210,7 +2694,119 @@
       </w:pPr>
     </w:lvl>
   </w:abstractNum>
-  <w:abstractNum w:abstractNumId="10" w15:restartNumberingAfterBreak="0">
+  <w:abstractNum w:abstractNumId="11" w15:restartNumberingAfterBreak="0">
+    <w:nsid w:val="3EEE70A5"/>
+    <w:multiLevelType w:val="hybridMultilevel"/>
+    <w:tmpl w:val="E64C9A50"/>
+    <w:lvl w:ilvl="0" w:tplc="08090001">
+      <w:numFmt w:val="bullet"/>
+      <w:lvlText w:val=""/>
+      <w:lvlJc w:val="left"/>
+      <w:pPr>
+        <w:ind w:left="720" w:hanging="360"/>
+      </w:pPr>
+      <w:rPr>
+        <w:rFonts w:ascii="Symbol" w:eastAsia="Times New Roman" w:hAnsi="Symbol" w:cs="Times New Roman" w:hint="default"/>
+      </w:rPr>
+    </w:lvl>
+    <w:lvl w:ilvl="1" w:tplc="08090003" w:tentative="1">
+      <w:start w:val="1"/>
+      <w:numFmt w:val="bullet"/>
+      <w:lvlText w:val="o"/>
+      <w:lvlJc w:val="left"/>
+      <w:pPr>
+        <w:ind w:left="1440" w:hanging="360"/>
+      </w:pPr>
+      <w:rPr>
+        <w:rFonts w:ascii="Courier New" w:hAnsi="Courier New" w:cs="Courier New" w:hint="default"/>
+      </w:rPr>
+    </w:lvl>
+    <w:lvl w:ilvl="2" w:tplc="08090005" w:tentative="1">
+      <w:start w:val="1"/>
+      <w:numFmt w:val="bullet"/>
+      <w:lvlText w:val=""/>
+      <w:lvlJc w:val="left"/>
+      <w:pPr>
+        <w:ind w:left="2160" w:hanging="360"/>
+      </w:pPr>
+      <w:rPr>
+        <w:rFonts w:ascii="Wingdings" w:hAnsi="Wingdings" w:hint="default"/>
+      </w:rPr>
+    </w:lvl>
+    <w:lvl w:ilvl="3" w:tplc="08090001" w:tentative="1">
+      <w:start w:val="1"/>
+      <w:numFmt w:val="bullet"/>
+      <w:lvlText w:val=""/>
+      <w:lvlJc w:val="left"/>
+      <w:pPr>
+        <w:ind w:left="2880" w:hanging="360"/>
+      </w:pPr>
+      <w:rPr>
+        <w:rFonts w:ascii="Symbol" w:hAnsi="Symbol" w:hint="default"/>
+      </w:rPr>
+    </w:lvl>
+    <w:lvl w:ilvl="4" w:tplc="08090003" w:tentative="1">
+      <w:start w:val="1"/>
+      <w:numFmt w:val="bullet"/>
+      <w:lvlText w:val="o"/>
+      <w:lvlJc w:val="left"/>
+      <w:pPr>
+        <w:ind w:left="3600" w:hanging="360"/>
+      </w:pPr>
+      <w:rPr>
+        <w:rFonts w:ascii="Courier New" w:hAnsi="Courier New" w:cs="Courier New" w:hint="default"/>
+      </w:rPr>
+    </w:lvl>
+    <w:lvl w:ilvl="5" w:tplc="08090005" w:tentative="1">
+      <w:start w:val="1"/>
+      <w:numFmt w:val="bullet"/>
+      <w:lvlText w:val=""/>
+      <w:lvlJc w:val="left"/>
+      <w:pPr>
+        <w:ind w:left="4320" w:hanging="360"/>
+      </w:pPr>
+      <w:rPr>
+        <w:rFonts w:ascii="Wingdings" w:hAnsi="Wingdings" w:hint="default"/>
+      </w:rPr>
+    </w:lvl>
+    <w:lvl w:ilvl="6" w:tplc="08090001" w:tentative="1">
+      <w:start w:val="1"/>
+      <w:numFmt w:val="bullet"/>
+      <w:lvlText w:val=""/>
+      <w:lvlJc w:val="left"/>
+      <w:pPr>
+        <w:ind w:left="5040" w:hanging="360"/>
+      </w:pPr>
+      <w:rPr>
+        <w:rFonts w:ascii="Symbol" w:hAnsi="Symbol" w:hint="default"/>
+      </w:rPr>
+    </w:lvl>
+    <w:lvl w:ilvl="7" w:tplc="08090003" w:tentative="1">
+      <w:start w:val="1"/>
+      <w:numFmt w:val="bullet"/>
+      <w:lvlText w:val="o"/>
+      <w:lvlJc w:val="left"/>
+      <w:pPr>
+        <w:ind w:left="5760" w:hanging="360"/>
+      </w:pPr>
+      <w:rPr>
+        <w:rFonts w:ascii="Courier New" w:hAnsi="Courier New" w:cs="Courier New" w:hint="default"/>
+      </w:rPr>
+    </w:lvl>
+    <w:lvl w:ilvl="8" w:tplc="08090005" w:tentative="1">
+      <w:start w:val="1"/>
+      <w:numFmt w:val="bullet"/>
+      <w:lvlText w:val=""/>
+      <w:lvlJc w:val="left"/>
+      <w:pPr>
+        <w:ind w:left="6480" w:hanging="360"/>
+      </w:pPr>
+      <w:rPr>
+        <w:rFonts w:ascii="Wingdings" w:hAnsi="Wingdings" w:hint="default"/>
+      </w:rPr>
+    </w:lvl>
+  </w:abstractNum>
+  <w:abstractNum w:abstractNumId="12" w15:restartNumberingAfterBreak="0">
     <w:nsid w:val="4AE50085"/>
     <w:multiLevelType w:val="hybridMultilevel"/>
     <w:tmpl w:val="41BC3094"/>
@@ -2323,7 +2919,7 @@
       </w:rPr>
     </w:lvl>
   </w:abstractNum>
-  <w:abstractNum w:abstractNumId="11" w15:restartNumberingAfterBreak="0">
+  <w:abstractNum w:abstractNumId="13" w15:restartNumberingAfterBreak="0">
     <w:nsid w:val="4D6556B6"/>
     <w:multiLevelType w:val="multilevel"/>
     <w:tmpl w:val="BA8C1170"/>
@@ -2472,7 +3068,120 @@
       </w:rPr>
     </w:lvl>
   </w:abstractNum>
-  <w:abstractNum w:abstractNumId="12" w15:restartNumberingAfterBreak="0">
+  <w:abstractNum w:abstractNumId="14" w15:restartNumberingAfterBreak="0">
+    <w:nsid w:val="6834607E"/>
+    <w:multiLevelType w:val="hybridMultilevel"/>
+    <w:tmpl w:val="3A843526"/>
+    <w:lvl w:ilvl="0" w:tplc="08090001">
+      <w:start w:val="1"/>
+      <w:numFmt w:val="bullet"/>
+      <w:lvlText w:val=""/>
+      <w:lvlJc w:val="left"/>
+      <w:pPr>
+        <w:ind w:left="1080" w:hanging="360"/>
+      </w:pPr>
+      <w:rPr>
+        <w:rFonts w:ascii="Symbol" w:hAnsi="Symbol" w:hint="default"/>
+      </w:rPr>
+    </w:lvl>
+    <w:lvl w:ilvl="1" w:tplc="08090003" w:tentative="1">
+      <w:start w:val="1"/>
+      <w:numFmt w:val="bullet"/>
+      <w:lvlText w:val="o"/>
+      <w:lvlJc w:val="left"/>
+      <w:pPr>
+        <w:ind w:left="1800" w:hanging="360"/>
+      </w:pPr>
+      <w:rPr>
+        <w:rFonts w:ascii="Courier New" w:hAnsi="Courier New" w:cs="Courier New" w:hint="default"/>
+      </w:rPr>
+    </w:lvl>
+    <w:lvl w:ilvl="2" w:tplc="08090005" w:tentative="1">
+      <w:start w:val="1"/>
+      <w:numFmt w:val="bullet"/>
+      <w:lvlText w:val=""/>
+      <w:lvlJc w:val="left"/>
+      <w:pPr>
+        <w:ind w:left="2520" w:hanging="360"/>
+      </w:pPr>
+      <w:rPr>
+        <w:rFonts w:ascii="Wingdings" w:hAnsi="Wingdings" w:hint="default"/>
+      </w:rPr>
+    </w:lvl>
+    <w:lvl w:ilvl="3" w:tplc="08090001" w:tentative="1">
+      <w:start w:val="1"/>
+      <w:numFmt w:val="bullet"/>
+      <w:lvlText w:val=""/>
+      <w:lvlJc w:val="left"/>
+      <w:pPr>
+        <w:ind w:left="3240" w:hanging="360"/>
+      </w:pPr>
+      <w:rPr>
+        <w:rFonts w:ascii="Symbol" w:hAnsi="Symbol" w:hint="default"/>
+      </w:rPr>
+    </w:lvl>
+    <w:lvl w:ilvl="4" w:tplc="08090003" w:tentative="1">
+      <w:start w:val="1"/>
+      <w:numFmt w:val="bullet"/>
+      <w:lvlText w:val="o"/>
+      <w:lvlJc w:val="left"/>
+      <w:pPr>
+        <w:ind w:left="3960" w:hanging="360"/>
+      </w:pPr>
+      <w:rPr>
+        <w:rFonts w:ascii="Courier New" w:hAnsi="Courier New" w:cs="Courier New" w:hint="default"/>
+      </w:rPr>
+    </w:lvl>
+    <w:lvl w:ilvl="5" w:tplc="08090005" w:tentative="1">
+      <w:start w:val="1"/>
+      <w:numFmt w:val="bullet"/>
+      <w:lvlText w:val=""/>
+      <w:lvlJc w:val="left"/>
+      <w:pPr>
+        <w:ind w:left="4680" w:hanging="360"/>
+      </w:pPr>
+      <w:rPr>
+        <w:rFonts w:ascii="Wingdings" w:hAnsi="Wingdings" w:hint="default"/>
+      </w:rPr>
+    </w:lvl>
+    <w:lvl w:ilvl="6" w:tplc="08090001" w:tentative="1">
+      <w:start w:val="1"/>
+      <w:numFmt w:val="bullet"/>
+      <w:lvlText w:val=""/>
+      <w:lvlJc w:val="left"/>
+      <w:pPr>
+        <w:ind w:left="5400" w:hanging="360"/>
+      </w:pPr>
+      <w:rPr>
+        <w:rFonts w:ascii="Symbol" w:hAnsi="Symbol" w:hint="default"/>
+      </w:rPr>
+    </w:lvl>
+    <w:lvl w:ilvl="7" w:tplc="08090003" w:tentative="1">
+      <w:start w:val="1"/>
+      <w:numFmt w:val="bullet"/>
+      <w:lvlText w:val="o"/>
+      <w:lvlJc w:val="left"/>
+      <w:pPr>
+        <w:ind w:left="6120" w:hanging="360"/>
+      </w:pPr>
+      <w:rPr>
+        <w:rFonts w:ascii="Courier New" w:hAnsi="Courier New" w:cs="Courier New" w:hint="default"/>
+      </w:rPr>
+    </w:lvl>
+    <w:lvl w:ilvl="8" w:tplc="08090005" w:tentative="1">
+      <w:start w:val="1"/>
+      <w:numFmt w:val="bullet"/>
+      <w:lvlText w:val=""/>
+      <w:lvlJc w:val="left"/>
+      <w:pPr>
+        <w:ind w:left="6840" w:hanging="360"/>
+      </w:pPr>
+      <w:rPr>
+        <w:rFonts w:ascii="Wingdings" w:hAnsi="Wingdings" w:hint="default"/>
+      </w:rPr>
+    </w:lvl>
+  </w:abstractNum>
+  <w:abstractNum w:abstractNumId="15" w15:restartNumberingAfterBreak="0">
     <w:nsid w:val="69634737"/>
     <w:multiLevelType w:val="multilevel"/>
     <w:tmpl w:val="9D4E5B8C"/>
@@ -2621,7 +3330,7 @@
       </w:rPr>
     </w:lvl>
   </w:abstractNum>
-  <w:abstractNum w:abstractNumId="13" w15:restartNumberingAfterBreak="0">
+  <w:abstractNum w:abstractNumId="16" w15:restartNumberingAfterBreak="0">
     <w:nsid w:val="6D0221D6"/>
     <w:multiLevelType w:val="hybridMultilevel"/>
     <w:tmpl w:val="9C6E8E18"/>
@@ -2733,7 +3442,7 @@
       </w:rPr>
     </w:lvl>
   </w:abstractNum>
-  <w:abstractNum w:abstractNumId="14" w15:restartNumberingAfterBreak="0">
+  <w:abstractNum w:abstractNumId="17" w15:restartNumberingAfterBreak="0">
     <w:nsid w:val="7A8B66C7"/>
     <w:multiLevelType w:val="multilevel"/>
     <w:tmpl w:val="738EABB2"/>
@@ -2882,7 +3591,96 @@
       </w:rPr>
     </w:lvl>
   </w:abstractNum>
-  <w:abstractNum w:abstractNumId="15" w15:restartNumberingAfterBreak="0">
+  <w:abstractNum w:abstractNumId="18" w15:restartNumberingAfterBreak="0">
+    <w:nsid w:val="7D1F57AA"/>
+    <w:multiLevelType w:val="hybridMultilevel"/>
+    <w:tmpl w:val="99FE4606"/>
+    <w:lvl w:ilvl="0" w:tplc="08090001">
+      <w:start w:val="1"/>
+      <w:numFmt w:val="bullet"/>
+      <w:lvlText w:val=""/>
+      <w:lvlJc w:val="left"/>
+      <w:pPr>
+        <w:ind w:left="720" w:hanging="360"/>
+      </w:pPr>
+      <w:rPr>
+        <w:rFonts w:ascii="Symbol" w:hAnsi="Symbol" w:hint="default"/>
+      </w:rPr>
+    </w:lvl>
+    <w:lvl w:ilvl="1" w:tplc="FFFFFFFF" w:tentative="1">
+      <w:start w:val="1"/>
+      <w:numFmt w:val="lowerLetter"/>
+      <w:lvlText w:val="%2."/>
+      <w:lvlJc w:val="left"/>
+      <w:pPr>
+        <w:ind w:left="1440" w:hanging="360"/>
+      </w:pPr>
+    </w:lvl>
+    <w:lvl w:ilvl="2" w:tplc="FFFFFFFF" w:tentative="1">
+      <w:start w:val="1"/>
+      <w:numFmt w:val="lowerRoman"/>
+      <w:lvlText w:val="%3."/>
+      <w:lvlJc w:val="right"/>
+      <w:pPr>
+        <w:ind w:left="2160" w:hanging="180"/>
+      </w:pPr>
+    </w:lvl>
+    <w:lvl w:ilvl="3" w:tplc="FFFFFFFF" w:tentative="1">
+      <w:start w:val="1"/>
+      <w:numFmt w:val="decimal"/>
+      <w:lvlText w:val="%4."/>
+      <w:lvlJc w:val="left"/>
+      <w:pPr>
+        <w:ind w:left="2880" w:hanging="360"/>
+      </w:pPr>
+    </w:lvl>
+    <w:lvl w:ilvl="4" w:tplc="FFFFFFFF" w:tentative="1">
+      <w:start w:val="1"/>
+      <w:numFmt w:val="lowerLetter"/>
+      <w:lvlText w:val="%5."/>
+      <w:lvlJc w:val="left"/>
+      <w:pPr>
+        <w:ind w:left="3600" w:hanging="360"/>
+      </w:pPr>
+    </w:lvl>
+    <w:lvl w:ilvl="5" w:tplc="FFFFFFFF" w:tentative="1">
+      <w:start w:val="1"/>
+      <w:numFmt w:val="lowerRoman"/>
+      <w:lvlText w:val="%6."/>
+      <w:lvlJc w:val="right"/>
+      <w:pPr>
+        <w:ind w:left="4320" w:hanging="180"/>
+      </w:pPr>
+    </w:lvl>
+    <w:lvl w:ilvl="6" w:tplc="FFFFFFFF" w:tentative="1">
+      <w:start w:val="1"/>
+      <w:numFmt w:val="decimal"/>
+      <w:lvlText w:val="%7."/>
+      <w:lvlJc w:val="left"/>
+      <w:pPr>
+        <w:ind w:left="5040" w:hanging="360"/>
+      </w:pPr>
+    </w:lvl>
+    <w:lvl w:ilvl="7" w:tplc="FFFFFFFF" w:tentative="1">
+      <w:start w:val="1"/>
+      <w:numFmt w:val="lowerLetter"/>
+      <w:lvlText w:val="%8."/>
+      <w:lvlJc w:val="left"/>
+      <w:pPr>
+        <w:ind w:left="5760" w:hanging="360"/>
+      </w:pPr>
+    </w:lvl>
+    <w:lvl w:ilvl="8" w:tplc="FFFFFFFF" w:tentative="1">
+      <w:start w:val="1"/>
+      <w:numFmt w:val="lowerRoman"/>
+      <w:lvlText w:val="%9."/>
+      <w:lvlJc w:val="right"/>
+      <w:pPr>
+        <w:ind w:left="6480" w:hanging="180"/>
+      </w:pPr>
+    </w:lvl>
+  </w:abstractNum>
+  <w:abstractNum w:abstractNumId="19" w15:restartNumberingAfterBreak="0">
     <w:nsid w:val="7E0B4360"/>
     <w:multiLevelType w:val="hybridMultilevel"/>
     <w:tmpl w:val="F1F86776"/>
@@ -2972,7 +3770,7 @@
     <w:abstractNumId w:val="3"/>
   </w:num>
   <w:num w:numId="2" w16cid:durableId="167447018">
-    <w:abstractNumId w:val="15"/>
+    <w:abstractNumId w:val="19"/>
   </w:num>
   <w:num w:numId="3" w16cid:durableId="1805348167">
     <w:abstractNumId w:val="1"/>
@@ -2984,25 +3782,25 @@
     <w:abstractNumId w:val="4"/>
   </w:num>
   <w:num w:numId="6" w16cid:durableId="768231768">
-    <w:abstractNumId w:val="11"/>
+    <w:abstractNumId w:val="13"/>
   </w:num>
   <w:num w:numId="7" w16cid:durableId="795097501">
-    <w:abstractNumId w:val="14"/>
+    <w:abstractNumId w:val="17"/>
   </w:num>
   <w:num w:numId="8" w16cid:durableId="920062351">
-    <w:abstractNumId w:val="12"/>
+    <w:abstractNumId w:val="15"/>
   </w:num>
   <w:num w:numId="9" w16cid:durableId="295112464">
     <w:abstractNumId w:val="0"/>
   </w:num>
   <w:num w:numId="10" w16cid:durableId="620917229">
-    <w:abstractNumId w:val="13"/>
+    <w:abstractNumId w:val="16"/>
   </w:num>
   <w:num w:numId="11" w16cid:durableId="278344280">
-    <w:abstractNumId w:val="10"/>
+    <w:abstractNumId w:val="12"/>
   </w:num>
   <w:num w:numId="12" w16cid:durableId="1027483658">
-    <w:abstractNumId w:val="9"/>
+    <w:abstractNumId w:val="10"/>
   </w:num>
   <w:num w:numId="13" w16cid:durableId="840243025">
     <w:abstractNumId w:val="5"/>
@@ -3015,6 +3813,18 @@
   </w:num>
   <w:num w:numId="16" w16cid:durableId="717244354">
     <w:abstractNumId w:val="2"/>
+  </w:num>
+  <w:num w:numId="17" w16cid:durableId="1738088801">
+    <w:abstractNumId w:val="18"/>
+  </w:num>
+  <w:num w:numId="18" w16cid:durableId="2020815646">
+    <w:abstractNumId w:val="9"/>
+  </w:num>
+  <w:num w:numId="19" w16cid:durableId="2079591350">
+    <w:abstractNumId w:val="11"/>
+  </w:num>
+  <w:num w:numId="20" w16cid:durableId="206769798">
+    <w:abstractNumId w:val="14"/>
   </w:num>
 </w:numbering>
 </file>
@@ -3625,6 +4435,7 @@
   <w:style w:type="character" w:default="1" w:styleId="DefaultParagraphFont">
     <w:name w:val="Default Paragraph Font"/>
     <w:uiPriority w:val="1"/>
+    <w:semiHidden/>
     <w:unhideWhenUsed/>
   </w:style>
   <w:style w:type="table" w:default="1" w:styleId="TableNormal">
@@ -3970,6 +4781,56 @@
       <w14:ligatures w14:val="none"/>
     </w:rPr>
   </w:style>
+  <w:style w:type="paragraph" w:styleId="Header">
+    <w:name w:val="header"/>
+    <w:basedOn w:val="Normal"/>
+    <w:link w:val="HeaderChar"/>
+    <w:uiPriority w:val="99"/>
+    <w:unhideWhenUsed/>
+    <w:rsid w:val="00410E05"/>
+    <w:pPr>
+      <w:tabs>
+        <w:tab w:val="center" w:pos="4513"/>
+        <w:tab w:val="right" w:pos="9026"/>
+      </w:tabs>
+      <w:spacing w:after="0" w:line="240" w:lineRule="auto"/>
+    </w:pPr>
+  </w:style>
+  <w:style w:type="character" w:customStyle="1" w:styleId="HeaderChar">
+    <w:name w:val="Header Char"/>
+    <w:basedOn w:val="DefaultParagraphFont"/>
+    <w:link w:val="Header"/>
+    <w:uiPriority w:val="99"/>
+    <w:rsid w:val="00410E05"/>
+    <w:rPr>
+      <w:lang w:val="el-GR"/>
+    </w:rPr>
+  </w:style>
+  <w:style w:type="paragraph" w:styleId="Footer">
+    <w:name w:val="footer"/>
+    <w:basedOn w:val="Normal"/>
+    <w:link w:val="FooterChar"/>
+    <w:uiPriority w:val="99"/>
+    <w:unhideWhenUsed/>
+    <w:rsid w:val="00410E05"/>
+    <w:pPr>
+      <w:tabs>
+        <w:tab w:val="center" w:pos="4513"/>
+        <w:tab w:val="right" w:pos="9026"/>
+      </w:tabs>
+      <w:spacing w:after="0" w:line="240" w:lineRule="auto"/>
+    </w:pPr>
+  </w:style>
+  <w:style w:type="character" w:customStyle="1" w:styleId="FooterChar">
+    <w:name w:val="Footer Char"/>
+    <w:basedOn w:val="DefaultParagraphFont"/>
+    <w:link w:val="Footer"/>
+    <w:uiPriority w:val="99"/>
+    <w:rsid w:val="00410E05"/>
+    <w:rPr>
+      <w:lang w:val="el-GR"/>
+    </w:rPr>
+  </w:style>
 </w:styles>
 </file>
 

</xml_diff>

<commit_message>
indez kai white update
</commit_message>
<xml_diff>
--- a/Ερωτηματολόγιο.docx
+++ b/Ερωτηματολόγιο.docx
@@ -33,7 +33,6 @@
           <w14:ligatures w14:val="standardContextual"/>
         </w:rPr>
       </w:pPr>
-      <w:proofErr w:type="spellStart"/>
       <w:r>
         <w:rPr>
           <w:rFonts w:asciiTheme="minorHAnsi" w:eastAsiaTheme="minorHAnsi" w:hAnsiTheme="minorHAnsi" w:cstheme="minorBidi"/>
@@ -43,43 +42,7 @@
           <w:lang w:val="el-GR" w:eastAsia="en-US"/>
           <w14:ligatures w14:val="standardContextual"/>
         </w:rPr>
-        <w:t>Κάτω</w:t>
-      </w:r>
-      <w:proofErr w:type="spellEnd"/>
-      <w:r>
-        <w:rPr>
-          <w:rFonts w:asciiTheme="minorHAnsi" w:eastAsiaTheme="minorHAnsi" w:hAnsiTheme="minorHAnsi" w:cstheme="minorBidi"/>
-          <w:kern w:val="2"/>
-          <w:sz w:val="22"/>
-          <w:szCs w:val="22"/>
-          <w:lang w:val="el-GR" w:eastAsia="en-US"/>
-          <w14:ligatures w14:val="standardContextual"/>
-        </w:rPr>
-        <w:t xml:space="preserve"> </w:t>
-      </w:r>
-      <w:proofErr w:type="spellStart"/>
-      <w:r>
-        <w:rPr>
-          <w:rFonts w:asciiTheme="minorHAnsi" w:eastAsiaTheme="minorHAnsi" w:hAnsiTheme="minorHAnsi" w:cstheme="minorBidi"/>
-          <w:kern w:val="2"/>
-          <w:sz w:val="22"/>
-          <w:szCs w:val="22"/>
-          <w:lang w:val="el-GR" w:eastAsia="en-US"/>
-          <w14:ligatures w14:val="standardContextual"/>
-        </w:rPr>
-        <w:t>των</w:t>
-      </w:r>
-      <w:proofErr w:type="spellEnd"/>
-      <w:r>
-        <w:rPr>
-          <w:rFonts w:asciiTheme="minorHAnsi" w:eastAsiaTheme="minorHAnsi" w:hAnsiTheme="minorHAnsi" w:cstheme="minorBidi"/>
-          <w:kern w:val="2"/>
-          <w:sz w:val="22"/>
-          <w:szCs w:val="22"/>
-          <w:lang w:val="el-GR" w:eastAsia="en-US"/>
-          <w14:ligatures w14:val="standardContextual"/>
-        </w:rPr>
-        <w:t xml:space="preserve"> 18</w:t>
+        <w:t>Κάτω των 18</w:t>
       </w:r>
     </w:p>
     <w:p>
@@ -247,21 +210,8 @@
           <w:lang w:val="el-GR" w:eastAsia="en-US"/>
           <w14:ligatures w14:val="standardContextual"/>
         </w:rPr>
-        <w:t xml:space="preserve">65 και </w:t>
-      </w:r>
-      <w:proofErr w:type="spellStart"/>
-      <w:r>
-        <w:rPr>
-          <w:rFonts w:asciiTheme="minorHAnsi" w:eastAsiaTheme="minorHAnsi" w:hAnsiTheme="minorHAnsi" w:cstheme="minorBidi"/>
-          <w:kern w:val="2"/>
-          <w:sz w:val="22"/>
-          <w:szCs w:val="22"/>
-          <w:lang w:val="el-GR" w:eastAsia="en-US"/>
-          <w14:ligatures w14:val="standardContextual"/>
-        </w:rPr>
-        <w:t>άνω</w:t>
-      </w:r>
-      <w:proofErr w:type="spellEnd"/>
+        <w:t>65 και άνω</w:t>
+      </w:r>
     </w:p>
     <w:p>
       <w:pPr>
@@ -279,7 +229,6 @@
           <w14:ligatures w14:val="standardContextual"/>
         </w:rPr>
       </w:pPr>
-      <w:proofErr w:type="spellStart"/>
       <w:r>
         <w:rPr>
           <w:rFonts w:asciiTheme="minorHAnsi" w:eastAsiaTheme="minorHAnsi" w:hAnsiTheme="minorHAnsi" w:cstheme="minorBidi"/>
@@ -289,57 +238,8 @@
           <w:lang w:val="el-GR" w:eastAsia="en-US"/>
           <w14:ligatures w14:val="standardContextual"/>
         </w:rPr>
-        <w:t>Δεν</w:t>
-      </w:r>
-      <w:proofErr w:type="spellEnd"/>
-      <w:r>
-        <w:rPr>
-          <w:rFonts w:asciiTheme="minorHAnsi" w:eastAsiaTheme="minorHAnsi" w:hAnsiTheme="minorHAnsi" w:cstheme="minorBidi"/>
-          <w:kern w:val="2"/>
-          <w:sz w:val="22"/>
-          <w:szCs w:val="22"/>
-          <w:lang w:val="el-GR" w:eastAsia="en-US"/>
-          <w14:ligatures w14:val="standardContextual"/>
-        </w:rPr>
-        <w:t xml:space="preserve"> επ</w:t>
-      </w:r>
-      <w:proofErr w:type="spellStart"/>
-      <w:r>
-        <w:rPr>
-          <w:rFonts w:asciiTheme="minorHAnsi" w:eastAsiaTheme="minorHAnsi" w:hAnsiTheme="minorHAnsi" w:cstheme="minorBidi"/>
-          <w:kern w:val="2"/>
-          <w:sz w:val="22"/>
-          <w:szCs w:val="22"/>
-          <w:lang w:val="el-GR" w:eastAsia="en-US"/>
-          <w14:ligatures w14:val="standardContextual"/>
-        </w:rPr>
-        <w:t>ιθυμώ</w:t>
-      </w:r>
-      <w:proofErr w:type="spellEnd"/>
-      <w:r>
-        <w:rPr>
-          <w:rFonts w:asciiTheme="minorHAnsi" w:eastAsiaTheme="minorHAnsi" w:hAnsiTheme="minorHAnsi" w:cstheme="minorBidi"/>
-          <w:kern w:val="2"/>
-          <w:sz w:val="22"/>
-          <w:szCs w:val="22"/>
-          <w:lang w:val="el-GR" w:eastAsia="en-US"/>
-          <w14:ligatures w14:val="standardContextual"/>
-        </w:rPr>
-        <w:t xml:space="preserve"> να απα</w:t>
-      </w:r>
-      <w:proofErr w:type="spellStart"/>
-      <w:r>
-        <w:rPr>
-          <w:rFonts w:asciiTheme="minorHAnsi" w:eastAsiaTheme="minorHAnsi" w:hAnsiTheme="minorHAnsi" w:cstheme="minorBidi"/>
-          <w:kern w:val="2"/>
-          <w:sz w:val="22"/>
-          <w:szCs w:val="22"/>
-          <w:lang w:val="el-GR" w:eastAsia="en-US"/>
-          <w14:ligatures w14:val="standardContextual"/>
-        </w:rPr>
-        <w:t>ντήσω</w:t>
-      </w:r>
-      <w:proofErr w:type="spellEnd"/>
+        <w:t>Δεν επιθυμώ να απαντήσω</w:t>
+      </w:r>
     </w:p>
     <w:p>
       <w:pPr>
@@ -843,6 +743,350 @@
     </w:p>
     <w:p/>
     <w:p>
+      <w:r>
+        <w:rPr>
+          <w:noProof/>
+        </w:rPr>
+        <mc:AlternateContent>
+          <mc:Choice Requires="wps">
+            <w:drawing>
+              <wp:anchor distT="0" distB="0" distL="114300" distR="114300" simplePos="0" relativeHeight="251665408" behindDoc="0" locked="0" layoutInCell="1" allowOverlap="1" wp14:anchorId="308E1D78" wp14:editId="393AFF62">
+                <wp:simplePos x="0" y="0"/>
+                <wp:positionH relativeFrom="column">
+                  <wp:posOffset>4460628</wp:posOffset>
+                </wp:positionH>
+                <wp:positionV relativeFrom="paragraph">
+                  <wp:posOffset>615798</wp:posOffset>
+                </wp:positionV>
+                <wp:extent cx="1440000" cy="720000"/>
+                <wp:effectExtent l="0" t="0" r="8255" b="4445"/>
+                <wp:wrapNone/>
+                <wp:docPr id="1203928646" name="Rectangle 1"/>
+                <wp:cNvGraphicFramePr>
+                  <a:graphicFrameLocks xmlns:a="http://schemas.openxmlformats.org/drawingml/2006/main" noChangeAspect="1"/>
+                </wp:cNvGraphicFramePr>
+                <a:graphic xmlns:a="http://schemas.openxmlformats.org/drawingml/2006/main">
+                  <a:graphicData uri="http://schemas.microsoft.com/office/word/2010/wordprocessingShape">
+                    <wps:wsp>
+                      <wps:cNvSpPr>
+                        <a:spLocks noChangeAspect="1"/>
+                      </wps:cNvSpPr>
+                      <wps:spPr>
+                        <a:xfrm>
+                          <a:off x="0" y="0"/>
+                          <a:ext cx="1440000" cy="720000"/>
+                        </a:xfrm>
+                        <a:prstGeom prst="rect">
+                          <a:avLst/>
+                        </a:prstGeom>
+                        <a:solidFill>
+                          <a:srgbClr val="1D1D1D"/>
+                        </a:solidFill>
+                        <a:ln>
+                          <a:noFill/>
+                        </a:ln>
+                      </wps:spPr>
+                      <wps:style>
+                        <a:lnRef idx="2">
+                          <a:schemeClr val="accent1">
+                            <a:shade val="15000"/>
+                          </a:schemeClr>
+                        </a:lnRef>
+                        <a:fillRef idx="1">
+                          <a:schemeClr val="accent1"/>
+                        </a:fillRef>
+                        <a:effectRef idx="0">
+                          <a:schemeClr val="accent1"/>
+                        </a:effectRef>
+                        <a:fontRef idx="minor">
+                          <a:schemeClr val="lt1"/>
+                        </a:fontRef>
+                      </wps:style>
+                      <wps:bodyPr rot="0" spcFirstLastPara="0" vertOverflow="overflow" horzOverflow="overflow" vert="horz" wrap="square" lIns="91440" tIns="45720" rIns="91440" bIns="45720" numCol="1" spcCol="0" rtlCol="0" fromWordArt="0" anchor="ctr" anchorCtr="0" forceAA="0" compatLnSpc="1">
+                        <a:prstTxWarp prst="textNoShape">
+                          <a:avLst/>
+                        </a:prstTxWarp>
+                        <a:noAutofit/>
+                      </wps:bodyPr>
+                    </wps:wsp>
+                  </a:graphicData>
+                </a:graphic>
+                <wp14:sizeRelH relativeFrom="margin">
+                  <wp14:pctWidth>0</wp14:pctWidth>
+                </wp14:sizeRelH>
+                <wp14:sizeRelV relativeFrom="margin">
+                  <wp14:pctHeight>0</wp14:pctHeight>
+                </wp14:sizeRelV>
+              </wp:anchor>
+            </w:drawing>
+          </mc:Choice>
+          <mc:Fallback>
+            <w:pict>
+              <v:rect w14:anchorId="7F429591" id="Rectangle 1" o:spid="_x0000_s1026" style="position:absolute;margin-left:351.25pt;margin-top:48.5pt;width:113.4pt;height:56.7pt;z-index:251665408;visibility:visible;mso-wrap-style:square;mso-width-percent:0;mso-height-percent:0;mso-wrap-distance-left:9pt;mso-wrap-distance-top:0;mso-wrap-distance-right:9pt;mso-wrap-distance-bottom:0;mso-position-horizontal:absolute;mso-position-horizontal-relative:text;mso-position-vertical:absolute;mso-position-vertical-relative:text;mso-width-percent:0;mso-height-percent:0;mso-width-relative:margin;mso-height-relative:margin;v-text-anchor:middle" o:gfxdata="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" fillcolor="#1d1d1d" stroked="f" strokeweight="1pt">
+                <o:lock v:ext="edit" aspectratio="t"/>
+              </v:rect>
+            </w:pict>
+          </mc:Fallback>
+        </mc:AlternateContent>
+      </w:r>
+      <w:r>
+        <w:rPr>
+          <w:noProof/>
+        </w:rPr>
+        <mc:AlternateContent>
+          <mc:Choice Requires="wps">
+            <w:drawing>
+              <wp:anchor distT="0" distB="0" distL="114300" distR="114300" simplePos="0" relativeHeight="251661312" behindDoc="0" locked="0" layoutInCell="1" allowOverlap="1" wp14:anchorId="219B03FC" wp14:editId="67CEEA7A">
+                <wp:simplePos x="0" y="0"/>
+                <wp:positionH relativeFrom="column">
+                  <wp:posOffset>3022306</wp:posOffset>
+                </wp:positionH>
+                <wp:positionV relativeFrom="paragraph">
+                  <wp:posOffset>618566</wp:posOffset>
+                </wp:positionV>
+                <wp:extent cx="1440000" cy="720000"/>
+                <wp:effectExtent l="0" t="0" r="8255" b="4445"/>
+                <wp:wrapNone/>
+                <wp:docPr id="1893615764" name="Rectangle 1"/>
+                <wp:cNvGraphicFramePr>
+                  <a:graphicFrameLocks xmlns:a="http://schemas.openxmlformats.org/drawingml/2006/main" noChangeAspect="1"/>
+                </wp:cNvGraphicFramePr>
+                <a:graphic xmlns:a="http://schemas.openxmlformats.org/drawingml/2006/main">
+                  <a:graphicData uri="http://schemas.microsoft.com/office/word/2010/wordprocessingShape">
+                    <wps:wsp>
+                      <wps:cNvSpPr>
+                        <a:spLocks noChangeAspect="1"/>
+                      </wps:cNvSpPr>
+                      <wps:spPr>
+                        <a:xfrm>
+                          <a:off x="0" y="0"/>
+                          <a:ext cx="1440000" cy="720000"/>
+                        </a:xfrm>
+                        <a:prstGeom prst="rect">
+                          <a:avLst/>
+                        </a:prstGeom>
+                        <a:solidFill>
+                          <a:srgbClr val="F2F2F2"/>
+                        </a:solidFill>
+                        <a:ln>
+                          <a:noFill/>
+                        </a:ln>
+                      </wps:spPr>
+                      <wps:style>
+                        <a:lnRef idx="2">
+                          <a:schemeClr val="accent1">
+                            <a:shade val="15000"/>
+                          </a:schemeClr>
+                        </a:lnRef>
+                        <a:fillRef idx="1">
+                          <a:schemeClr val="accent1"/>
+                        </a:fillRef>
+                        <a:effectRef idx="0">
+                          <a:schemeClr val="accent1"/>
+                        </a:effectRef>
+                        <a:fontRef idx="minor">
+                          <a:schemeClr val="lt1"/>
+                        </a:fontRef>
+                      </wps:style>
+                      <wps:bodyPr rot="0" spcFirstLastPara="0" vertOverflow="overflow" horzOverflow="overflow" vert="horz" wrap="square" lIns="91440" tIns="45720" rIns="91440" bIns="45720" numCol="1" spcCol="0" rtlCol="0" fromWordArt="0" anchor="ctr" anchorCtr="0" forceAA="0" compatLnSpc="1">
+                        <a:prstTxWarp prst="textNoShape">
+                          <a:avLst/>
+                        </a:prstTxWarp>
+                        <a:noAutofit/>
+                      </wps:bodyPr>
+                    </wps:wsp>
+                  </a:graphicData>
+                </a:graphic>
+                <wp14:sizeRelH relativeFrom="margin">
+                  <wp14:pctWidth>0</wp14:pctWidth>
+                </wp14:sizeRelH>
+                <wp14:sizeRelV relativeFrom="margin">
+                  <wp14:pctHeight>0</wp14:pctHeight>
+                </wp14:sizeRelV>
+              </wp:anchor>
+            </w:drawing>
+          </mc:Choice>
+          <mc:Fallback>
+            <w:pict>
+              <v:rect w14:anchorId="7A127B75" id="Rectangle 1" o:spid="_x0000_s1026" style="position:absolute;margin-left:238pt;margin-top:48.7pt;width:113.4pt;height:56.7pt;z-index:251661312;visibility:visible;mso-wrap-style:square;mso-width-percent:0;mso-height-percent:0;mso-wrap-distance-left:9pt;mso-wrap-distance-top:0;mso-wrap-distance-right:9pt;mso-wrap-distance-bottom:0;mso-position-horizontal:absolute;mso-position-horizontal-relative:text;mso-position-vertical:absolute;mso-position-vertical-relative:text;mso-width-percent:0;mso-height-percent:0;mso-width-relative:margin;mso-height-relative:margin;v-text-anchor:middle" o:gfxdata="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" fillcolor="#f2f2f2" stroked="f" strokeweight="1pt">
+                <o:lock v:ext="edit" aspectratio="t"/>
+              </v:rect>
+            </w:pict>
+          </mc:Fallback>
+        </mc:AlternateContent>
+      </w:r>
+      <w:r>
+        <w:rPr>
+          <w:noProof/>
+        </w:rPr>
+        <mc:AlternateContent>
+          <mc:Choice Requires="wps">
+            <w:drawing>
+              <wp:anchor distT="0" distB="0" distL="114300" distR="114300" simplePos="0" relativeHeight="251663360" behindDoc="0" locked="0" layoutInCell="1" allowOverlap="1" wp14:anchorId="1F3B22A8" wp14:editId="0057E1F0">
+                <wp:simplePos x="0" y="0"/>
+                <wp:positionH relativeFrom="column">
+                  <wp:posOffset>1584192</wp:posOffset>
+                </wp:positionH>
+                <wp:positionV relativeFrom="paragraph">
+                  <wp:posOffset>616661</wp:posOffset>
+                </wp:positionV>
+                <wp:extent cx="1439545" cy="719455"/>
+                <wp:effectExtent l="0" t="0" r="8255" b="4445"/>
+                <wp:wrapNone/>
+                <wp:docPr id="366849650" name="Rectangle 1"/>
+                <wp:cNvGraphicFramePr>
+                  <a:graphicFrameLocks xmlns:a="http://schemas.openxmlformats.org/drawingml/2006/main" noChangeAspect="1"/>
+                </wp:cNvGraphicFramePr>
+                <a:graphic xmlns:a="http://schemas.openxmlformats.org/drawingml/2006/main">
+                  <a:graphicData uri="http://schemas.microsoft.com/office/word/2010/wordprocessingShape">
+                    <wps:wsp>
+                      <wps:cNvSpPr>
+                        <a:spLocks noChangeAspect="1"/>
+                      </wps:cNvSpPr>
+                      <wps:spPr>
+                        <a:xfrm>
+                          <a:off x="0" y="0"/>
+                          <a:ext cx="1439545" cy="719455"/>
+                        </a:xfrm>
+                        <a:prstGeom prst="rect">
+                          <a:avLst/>
+                        </a:prstGeom>
+                        <a:solidFill>
+                          <a:srgbClr val="D9D9D9"/>
+                        </a:solidFill>
+                        <a:ln>
+                          <a:noFill/>
+                        </a:ln>
+                      </wps:spPr>
+                      <wps:style>
+                        <a:lnRef idx="2">
+                          <a:schemeClr val="accent1">
+                            <a:shade val="15000"/>
+                          </a:schemeClr>
+                        </a:lnRef>
+                        <a:fillRef idx="1">
+                          <a:schemeClr val="accent1"/>
+                        </a:fillRef>
+                        <a:effectRef idx="0">
+                          <a:schemeClr val="accent1"/>
+                        </a:effectRef>
+                        <a:fontRef idx="minor">
+                          <a:schemeClr val="lt1"/>
+                        </a:fontRef>
+                      </wps:style>
+                      <wps:bodyPr rot="0" spcFirstLastPara="0" vertOverflow="overflow" horzOverflow="overflow" vert="horz" wrap="square" lIns="91440" tIns="45720" rIns="91440" bIns="45720" numCol="1" spcCol="0" rtlCol="0" fromWordArt="0" anchor="ctr" anchorCtr="0" forceAA="0" compatLnSpc="1">
+                        <a:prstTxWarp prst="textNoShape">
+                          <a:avLst/>
+                        </a:prstTxWarp>
+                        <a:noAutofit/>
+                      </wps:bodyPr>
+                    </wps:wsp>
+                  </a:graphicData>
+                </a:graphic>
+                <wp14:sizeRelH relativeFrom="margin">
+                  <wp14:pctWidth>0</wp14:pctWidth>
+                </wp14:sizeRelH>
+                <wp14:sizeRelV relativeFrom="margin">
+                  <wp14:pctHeight>0</wp14:pctHeight>
+                </wp14:sizeRelV>
+              </wp:anchor>
+            </w:drawing>
+          </mc:Choice>
+          <mc:Fallback>
+            <w:pict>
+              <v:rect w14:anchorId="3E63B2F6" id="Rectangle 1" o:spid="_x0000_s1026" style="position:absolute;margin-left:124.75pt;margin-top:48.55pt;width:113.35pt;height:56.65pt;z-index:251663360;visibility:visible;mso-wrap-style:square;mso-width-percent:0;mso-height-percent:0;mso-wrap-distance-left:9pt;mso-wrap-distance-top:0;mso-wrap-distance-right:9pt;mso-wrap-distance-bottom:0;mso-position-horizontal:absolute;mso-position-horizontal-relative:text;mso-position-vertical:absolute;mso-position-vertical-relative:text;mso-width-percent:0;mso-height-percent:0;mso-width-relative:margin;mso-height-relative:margin;v-text-anchor:middle" o:gfxdata="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" fillcolor="#d9d9d9" stroked="f" strokeweight="1pt">
+                <o:lock v:ext="edit" aspectratio="t"/>
+              </v:rect>
+            </w:pict>
+          </mc:Fallback>
+        </mc:AlternateContent>
+      </w:r>
+      <w:r>
+        <w:rPr>
+          <w:noProof/>
+        </w:rPr>
+        <mc:AlternateContent>
+          <mc:Choice Requires="wps">
+            <w:drawing>
+              <wp:anchor distT="0" distB="0" distL="114300" distR="114300" simplePos="0" relativeHeight="251659264" behindDoc="0" locked="0" layoutInCell="1" allowOverlap="1" wp14:anchorId="4996F7DD" wp14:editId="00997FC9">
+                <wp:simplePos x="0" y="0"/>
+                <wp:positionH relativeFrom="column">
+                  <wp:posOffset>146164</wp:posOffset>
+                </wp:positionH>
+                <wp:positionV relativeFrom="paragraph">
+                  <wp:posOffset>622442</wp:posOffset>
+                </wp:positionV>
+                <wp:extent cx="1440000" cy="720000"/>
+                <wp:effectExtent l="0" t="0" r="8255" b="4445"/>
+                <wp:wrapNone/>
+                <wp:docPr id="106220852" name="Rectangle 1"/>
+                <wp:cNvGraphicFramePr>
+                  <a:graphicFrameLocks xmlns:a="http://schemas.openxmlformats.org/drawingml/2006/main" noChangeAspect="1"/>
+                </wp:cNvGraphicFramePr>
+                <a:graphic xmlns:a="http://schemas.openxmlformats.org/drawingml/2006/main">
+                  <a:graphicData uri="http://schemas.microsoft.com/office/word/2010/wordprocessingShape">
+                    <wps:wsp>
+                      <wps:cNvSpPr>
+                        <a:spLocks noChangeAspect="1"/>
+                      </wps:cNvSpPr>
+                      <wps:spPr>
+                        <a:xfrm>
+                          <a:off x="0" y="0"/>
+                          <a:ext cx="1440000" cy="720000"/>
+                        </a:xfrm>
+                        <a:prstGeom prst="rect">
+                          <a:avLst/>
+                        </a:prstGeom>
+                        <a:solidFill>
+                          <a:srgbClr val="2563EB"/>
+                        </a:solidFill>
+                        <a:ln>
+                          <a:noFill/>
+                        </a:ln>
+                      </wps:spPr>
+                      <wps:style>
+                        <a:lnRef idx="2">
+                          <a:schemeClr val="accent1">
+                            <a:shade val="15000"/>
+                          </a:schemeClr>
+                        </a:lnRef>
+                        <a:fillRef idx="1">
+                          <a:schemeClr val="accent1"/>
+                        </a:fillRef>
+                        <a:effectRef idx="0">
+                          <a:schemeClr val="accent1"/>
+                        </a:effectRef>
+                        <a:fontRef idx="minor">
+                          <a:schemeClr val="lt1"/>
+                        </a:fontRef>
+                      </wps:style>
+                      <wps:bodyPr rot="0" spcFirstLastPara="0" vertOverflow="overflow" horzOverflow="overflow" vert="horz" wrap="square" lIns="91440" tIns="45720" rIns="91440" bIns="45720" numCol="1" spcCol="0" rtlCol="0" fromWordArt="0" anchor="ctr" anchorCtr="0" forceAA="0" compatLnSpc="1">
+                        <a:prstTxWarp prst="textNoShape">
+                          <a:avLst/>
+                        </a:prstTxWarp>
+                        <a:noAutofit/>
+                      </wps:bodyPr>
+                    </wps:wsp>
+                  </a:graphicData>
+                </a:graphic>
+                <wp14:sizeRelH relativeFrom="margin">
+                  <wp14:pctWidth>0</wp14:pctWidth>
+                </wp14:sizeRelH>
+                <wp14:sizeRelV relativeFrom="margin">
+                  <wp14:pctHeight>0</wp14:pctHeight>
+                </wp14:sizeRelV>
+              </wp:anchor>
+            </w:drawing>
+          </mc:Choice>
+          <mc:Fallback>
+            <w:pict>
+              <v:rect w14:anchorId="621C56B3" id="Rectangle 1" o:spid="_x0000_s1026" style="position:absolute;margin-left:11.5pt;margin-top:49pt;width:113.4pt;height:56.7pt;z-index:251659264;visibility:visible;mso-wrap-style:square;mso-width-percent:0;mso-height-percent:0;mso-wrap-distance-left:9pt;mso-wrap-distance-top:0;mso-wrap-distance-right:9pt;mso-wrap-distance-bottom:0;mso-position-horizontal:absolute;mso-position-horizontal-relative:text;mso-position-vertical:absolute;mso-position-vertical-relative:text;mso-width-percent:0;mso-height-percent:0;mso-width-relative:margin;mso-height-relative:margin;v-text-anchor:middle" o:gfxdata="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" fillcolor="#2563eb" stroked="f" strokeweight="1pt">
+                <o:lock v:ext="edit" aspectratio="t"/>
+              </v:rect>
+            </w:pict>
+          </mc:Fallback>
+        </mc:AlternateContent>
+      </w:r>
       <w:r>
         <w:rPr>
           <w:noProof/>
@@ -922,7 +1166,7 @@
           </mc:Choice>
           <mc:Fallback>
             <w:pict>
-              <v:rect w14:anchorId="0DDC987B" id="Rectangle 1" o:spid="_x0000_s1026" style="position:absolute;margin-left:139pt;margin-top:412.85pt;width:113.4pt;height:56.7pt;z-index:251673600;visibility:visible;mso-wrap-style:square;mso-width-percent:0;mso-height-percent:0;mso-wrap-distance-left:9pt;mso-wrap-distance-top:0;mso-wrap-distance-right:9pt;mso-wrap-distance-bottom:0;mso-position-horizontal:absolute;mso-position-horizontal-relative:text;mso-position-vertical:absolute;mso-position-vertical-relative:text;mso-width-percent:0;mso-height-percent:0;mso-width-relative:margin;mso-height-relative:margin;v-text-anchor:middle" o:gfxdata="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" fillcolor="#cdcdcd" stroked="f" strokeweight="1pt">
+              <v:rect w14:anchorId="09159050" id="Rectangle 1" o:spid="_x0000_s1026" style="position:absolute;margin-left:139pt;margin-top:412.85pt;width:113.4pt;height:56.7pt;z-index:251673600;visibility:visible;mso-wrap-style:square;mso-width-percent:0;mso-height-percent:0;mso-wrap-distance-left:9pt;mso-wrap-distance-top:0;mso-wrap-distance-right:9pt;mso-wrap-distance-bottom:0;mso-position-horizontal:absolute;mso-position-horizontal-relative:text;mso-position-vertical:absolute;mso-position-vertical-relative:text;mso-width-percent:0;mso-height-percent:0;mso-width-relative:margin;mso-height-relative:margin;v-text-anchor:middle" o:gfxdata="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" fillcolor="#cdcdcd" stroked="f" strokeweight="1pt">
                 <o:lock v:ext="edit" aspectratio="t"/>
               </v:rect>
             </w:pict>
@@ -1008,7 +1252,7 @@
           </mc:Choice>
           <mc:Fallback>
             <w:pict>
-              <v:rect w14:anchorId="5392F0CC" id="Rectangle 1" o:spid="_x0000_s1026" style="position:absolute;margin-left:139.65pt;margin-top:299.25pt;width:113.4pt;height:56.7pt;z-index:251667456;visibility:visible;mso-wrap-style:square;mso-width-percent:0;mso-height-percent:0;mso-wrap-distance-left:9pt;mso-wrap-distance-top:0;mso-wrap-distance-right:9pt;mso-wrap-distance-bottom:0;mso-position-horizontal:absolute;mso-position-horizontal-relative:text;mso-position-vertical:absolute;mso-position-vertical-relative:text;mso-width-percent:0;mso-height-percent:0;mso-width-relative:margin;mso-height-relative:margin;v-text-anchor:middle" o:gfxdata="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" fillcolor="#262626" stroked="f" strokeweight="1pt">
+              <v:rect w14:anchorId="49B2441A" id="Rectangle 1" o:spid="_x0000_s1026" style="position:absolute;margin-left:139.65pt;margin-top:299.25pt;width:113.4pt;height:56.7pt;z-index:251667456;visibility:visible;mso-wrap-style:square;mso-width-percent:0;mso-height-percent:0;mso-wrap-distance-left:9pt;mso-wrap-distance-top:0;mso-wrap-distance-right:9pt;mso-wrap-distance-bottom:0;mso-position-horizontal:absolute;mso-position-horizontal-relative:text;mso-position-vertical:absolute;mso-position-vertical-relative:text;mso-width-percent:0;mso-height-percent:0;mso-width-relative:margin;mso-height-relative:margin;v-text-anchor:middle" o:gfxdata="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" fillcolor="#262626" stroked="f" strokeweight="1pt">
                 <o:lock v:ext="edit" aspectratio="t"/>
               </v:rect>
             </w:pict>
@@ -1094,7 +1338,7 @@
           </mc:Choice>
           <mc:Fallback>
             <w:pict>
-              <v:rect w14:anchorId="4AD139C6" id="Rectangle 1" o:spid="_x0000_s1026" style="position:absolute;margin-left:82.85pt;margin-top:356pt;width:113.4pt;height:56.7pt;z-index:251669504;visibility:visible;mso-wrap-style:square;mso-width-percent:0;mso-height-percent:0;mso-wrap-distance-left:9pt;mso-wrap-distance-top:0;mso-wrap-distance-right:9pt;mso-wrap-distance-bottom:0;mso-position-horizontal:absolute;mso-position-horizontal-relative:text;mso-position-vertical:absolute;mso-position-vertical-relative:text;mso-width-percent:0;mso-height-percent:0;mso-width-relative:margin;mso-height-relative:margin;v-text-anchor:middle" o:gfxdata="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" fillcolor="#b341d3" stroked="f" strokeweight="1pt">
+              <v:rect w14:anchorId="0BFD8D62" id="Rectangle 1" o:spid="_x0000_s1026" style="position:absolute;margin-left:82.85pt;margin-top:356pt;width:113.4pt;height:56.7pt;z-index:251669504;visibility:visible;mso-wrap-style:square;mso-width-percent:0;mso-height-percent:0;mso-wrap-distance-left:9pt;mso-wrap-distance-top:0;mso-wrap-distance-right:9pt;mso-wrap-distance-bottom:0;mso-position-horizontal:absolute;mso-position-horizontal-relative:text;mso-position-vertical:absolute;mso-position-vertical-relative:text;mso-width-percent:0;mso-height-percent:0;mso-width-relative:margin;mso-height-relative:margin;v-text-anchor:middle" o:gfxdata="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" fillcolor="#b341d3" stroked="f" strokeweight="1pt">
                 <o:lock v:ext="edit" aspectratio="t"/>
               </v:rect>
             </w:pict>
@@ -1108,7 +1352,7 @@
         <mc:AlternateContent>
           <mc:Choice Requires="wps">
             <w:drawing>
-              <wp:anchor distT="0" distB="0" distL="114300" distR="114300" simplePos="0" relativeHeight="251671552" behindDoc="0" locked="0" layoutInCell="1" allowOverlap="1" wp14:anchorId="69CEACD0" wp14:editId="2FC4F79F">
+              <wp:anchor distT="0" distB="0" distL="114300" distR="114300" simplePos="0" relativeHeight="251671552" behindDoc="0" locked="0" layoutInCell="1" allowOverlap="1" wp14:anchorId="69CEACD0" wp14:editId="364B5D33">
                 <wp:simplePos x="0" y="0"/>
                 <wp:positionH relativeFrom="column">
                   <wp:posOffset>2491113</wp:posOffset>
@@ -1180,351 +1424,7 @@
           </mc:Choice>
           <mc:Fallback>
             <w:pict>
-              <v:rect w14:anchorId="45CC6618" id="Rectangle 1" o:spid="_x0000_s1026" style="position:absolute;margin-left:196.15pt;margin-top:356pt;width:113.4pt;height:56.7pt;z-index:251671552;visibility:visible;mso-wrap-style:square;mso-width-percent:0;mso-height-percent:0;mso-wrap-distance-left:9pt;mso-wrap-distance-top:0;mso-wrap-distance-right:9pt;mso-wrap-distance-bottom:0;mso-position-horizontal:absolute;mso-position-horizontal-relative:text;mso-position-vertical:absolute;mso-position-vertical-relative:text;mso-width-percent:0;mso-height-percent:0;mso-width-relative:margin;mso-height-relative:margin;v-text-anchor:middle" o:gfxdata="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" fillcolor="#2dc9c4" stroked="f" strokeweight="1pt">
-                <o:lock v:ext="edit" aspectratio="t"/>
-              </v:rect>
-            </w:pict>
-          </mc:Fallback>
-        </mc:AlternateContent>
-      </w:r>
-      <w:r>
-        <w:rPr>
-          <w:noProof/>
-        </w:rPr>
-        <mc:AlternateContent>
-          <mc:Choice Requires="wps">
-            <w:drawing>
-              <wp:anchor distT="0" distB="0" distL="114300" distR="114300" simplePos="0" relativeHeight="251665408" behindDoc="0" locked="0" layoutInCell="1" allowOverlap="1" wp14:anchorId="308E1D78" wp14:editId="0025FEF1">
-                <wp:simplePos x="0" y="0"/>
-                <wp:positionH relativeFrom="column">
-                  <wp:posOffset>1854612</wp:posOffset>
-                </wp:positionH>
-                <wp:positionV relativeFrom="paragraph">
-                  <wp:posOffset>2008316</wp:posOffset>
-                </wp:positionV>
-                <wp:extent cx="1440000" cy="720000"/>
-                <wp:effectExtent l="0" t="0" r="8255" b="4445"/>
-                <wp:wrapNone/>
-                <wp:docPr id="1203928646" name="Rectangle 1"/>
-                <wp:cNvGraphicFramePr>
-                  <a:graphicFrameLocks xmlns:a="http://schemas.openxmlformats.org/drawingml/2006/main" noChangeAspect="1"/>
-                </wp:cNvGraphicFramePr>
-                <a:graphic xmlns:a="http://schemas.openxmlformats.org/drawingml/2006/main">
-                  <a:graphicData uri="http://schemas.microsoft.com/office/word/2010/wordprocessingShape">
-                    <wps:wsp>
-                      <wps:cNvSpPr>
-                        <a:spLocks noChangeAspect="1"/>
-                      </wps:cNvSpPr>
-                      <wps:spPr>
-                        <a:xfrm>
-                          <a:off x="0" y="0"/>
-                          <a:ext cx="1440000" cy="720000"/>
-                        </a:xfrm>
-                        <a:prstGeom prst="rect">
-                          <a:avLst/>
-                        </a:prstGeom>
-                        <a:solidFill>
-                          <a:srgbClr val="1D1D1D"/>
-                        </a:solidFill>
-                        <a:ln>
-                          <a:noFill/>
-                        </a:ln>
-                      </wps:spPr>
-                      <wps:style>
-                        <a:lnRef idx="2">
-                          <a:schemeClr val="accent1">
-                            <a:shade val="15000"/>
-                          </a:schemeClr>
-                        </a:lnRef>
-                        <a:fillRef idx="1">
-                          <a:schemeClr val="accent1"/>
-                        </a:fillRef>
-                        <a:effectRef idx="0">
-                          <a:schemeClr val="accent1"/>
-                        </a:effectRef>
-                        <a:fontRef idx="minor">
-                          <a:schemeClr val="lt1"/>
-                        </a:fontRef>
-                      </wps:style>
-                      <wps:bodyPr rot="0" spcFirstLastPara="0" vertOverflow="overflow" horzOverflow="overflow" vert="horz" wrap="square" lIns="91440" tIns="45720" rIns="91440" bIns="45720" numCol="1" spcCol="0" rtlCol="0" fromWordArt="0" anchor="ctr" anchorCtr="0" forceAA="0" compatLnSpc="1">
-                        <a:prstTxWarp prst="textNoShape">
-                          <a:avLst/>
-                        </a:prstTxWarp>
-                        <a:noAutofit/>
-                      </wps:bodyPr>
-                    </wps:wsp>
-                  </a:graphicData>
-                </a:graphic>
-                <wp14:sizeRelH relativeFrom="margin">
-                  <wp14:pctWidth>0</wp14:pctWidth>
-                </wp14:sizeRelH>
-                <wp14:sizeRelV relativeFrom="margin">
-                  <wp14:pctHeight>0</wp14:pctHeight>
-                </wp14:sizeRelV>
-              </wp:anchor>
-            </w:drawing>
-          </mc:Choice>
-          <mc:Fallback>
-            <w:pict>
-              <v:rect w14:anchorId="5A1C5B7A" id="Rectangle 1" o:spid="_x0000_s1026" style="position:absolute;margin-left:146.05pt;margin-top:158.15pt;width:113.4pt;height:56.7pt;z-index:251665408;visibility:visible;mso-wrap-style:square;mso-width-percent:0;mso-height-percent:0;mso-wrap-distance-left:9pt;mso-wrap-distance-top:0;mso-wrap-distance-right:9pt;mso-wrap-distance-bottom:0;mso-position-horizontal:absolute;mso-position-horizontal-relative:text;mso-position-vertical:absolute;mso-position-vertical-relative:text;mso-width-percent:0;mso-height-percent:0;mso-width-relative:margin;mso-height-relative:margin;v-text-anchor:middle" o:gfxdata="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" fillcolor="#1d1d1d" stroked="f" strokeweight="1pt">
-                <o:lock v:ext="edit" aspectratio="t"/>
-              </v:rect>
-            </w:pict>
-          </mc:Fallback>
-        </mc:AlternateContent>
-      </w:r>
-      <w:r>
-        <w:rPr>
-          <w:noProof/>
-        </w:rPr>
-        <mc:AlternateContent>
-          <mc:Choice Requires="wps">
-            <w:drawing>
-              <wp:anchor distT="0" distB="0" distL="114300" distR="114300" simplePos="0" relativeHeight="251659264" behindDoc="0" locked="0" layoutInCell="1" allowOverlap="1" wp14:anchorId="4996F7DD" wp14:editId="7A71B99E">
-                <wp:simplePos x="0" y="0"/>
-                <wp:positionH relativeFrom="column">
-                  <wp:posOffset>1845813</wp:posOffset>
-                </wp:positionH>
-                <wp:positionV relativeFrom="paragraph">
-                  <wp:posOffset>575006</wp:posOffset>
-                </wp:positionV>
-                <wp:extent cx="1440000" cy="720000"/>
-                <wp:effectExtent l="0" t="0" r="8255" b="4445"/>
-                <wp:wrapNone/>
-                <wp:docPr id="106220852" name="Rectangle 1"/>
-                <wp:cNvGraphicFramePr>
-                  <a:graphicFrameLocks xmlns:a="http://schemas.openxmlformats.org/drawingml/2006/main" noChangeAspect="1"/>
-                </wp:cNvGraphicFramePr>
-                <a:graphic xmlns:a="http://schemas.openxmlformats.org/drawingml/2006/main">
-                  <a:graphicData uri="http://schemas.microsoft.com/office/word/2010/wordprocessingShape">
-                    <wps:wsp>
-                      <wps:cNvSpPr>
-                        <a:spLocks noChangeAspect="1"/>
-                      </wps:cNvSpPr>
-                      <wps:spPr>
-                        <a:xfrm>
-                          <a:off x="0" y="0"/>
-                          <a:ext cx="1440000" cy="720000"/>
-                        </a:xfrm>
-                        <a:prstGeom prst="rect">
-                          <a:avLst/>
-                        </a:prstGeom>
-                        <a:solidFill>
-                          <a:srgbClr val="2563EB"/>
-                        </a:solidFill>
-                        <a:ln>
-                          <a:noFill/>
-                        </a:ln>
-                      </wps:spPr>
-                      <wps:style>
-                        <a:lnRef idx="2">
-                          <a:schemeClr val="accent1">
-                            <a:shade val="15000"/>
-                          </a:schemeClr>
-                        </a:lnRef>
-                        <a:fillRef idx="1">
-                          <a:schemeClr val="accent1"/>
-                        </a:fillRef>
-                        <a:effectRef idx="0">
-                          <a:schemeClr val="accent1"/>
-                        </a:effectRef>
-                        <a:fontRef idx="minor">
-                          <a:schemeClr val="lt1"/>
-                        </a:fontRef>
-                      </wps:style>
-                      <wps:bodyPr rot="0" spcFirstLastPara="0" vertOverflow="overflow" horzOverflow="overflow" vert="horz" wrap="square" lIns="91440" tIns="45720" rIns="91440" bIns="45720" numCol="1" spcCol="0" rtlCol="0" fromWordArt="0" anchor="ctr" anchorCtr="0" forceAA="0" compatLnSpc="1">
-                        <a:prstTxWarp prst="textNoShape">
-                          <a:avLst/>
-                        </a:prstTxWarp>
-                        <a:noAutofit/>
-                      </wps:bodyPr>
-                    </wps:wsp>
-                  </a:graphicData>
-                </a:graphic>
-                <wp14:sizeRelH relativeFrom="margin">
-                  <wp14:pctWidth>0</wp14:pctWidth>
-                </wp14:sizeRelH>
-                <wp14:sizeRelV relativeFrom="margin">
-                  <wp14:pctHeight>0</wp14:pctHeight>
-                </wp14:sizeRelV>
-              </wp:anchor>
-            </w:drawing>
-          </mc:Choice>
-          <mc:Fallback>
-            <w:pict>
-              <v:rect w14:anchorId="4C34E7CD" id="Rectangle 1" o:spid="_x0000_s1026" style="position:absolute;margin-left:145.35pt;margin-top:45.3pt;width:113.4pt;height:56.7pt;z-index:251659264;visibility:visible;mso-wrap-style:square;mso-width-percent:0;mso-height-percent:0;mso-wrap-distance-left:9pt;mso-wrap-distance-top:0;mso-wrap-distance-right:9pt;mso-wrap-distance-bottom:0;mso-position-horizontal:absolute;mso-position-horizontal-relative:text;mso-position-vertical:absolute;mso-position-vertical-relative:text;mso-width-percent:0;mso-height-percent:0;mso-width-relative:margin;mso-height-relative:margin;v-text-anchor:middle" o:gfxdata="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" fillcolor="#2563eb" stroked="f" strokeweight="1pt">
-                <o:lock v:ext="edit" aspectratio="t"/>
-              </v:rect>
-            </w:pict>
-          </mc:Fallback>
-        </mc:AlternateContent>
-      </w:r>
-      <w:r>
-        <w:rPr>
-          <w:noProof/>
-        </w:rPr>
-        <mc:AlternateContent>
-          <mc:Choice Requires="wps">
-            <w:drawing>
-              <wp:anchor distT="0" distB="0" distL="114300" distR="114300" simplePos="0" relativeHeight="251663360" behindDoc="0" locked="0" layoutInCell="1" allowOverlap="1" wp14:anchorId="1F3B22A8" wp14:editId="65D06ACD">
-                <wp:simplePos x="0" y="0"/>
-                <wp:positionH relativeFrom="column">
-                  <wp:posOffset>1134110</wp:posOffset>
-                </wp:positionH>
-                <wp:positionV relativeFrom="paragraph">
-                  <wp:posOffset>1292225</wp:posOffset>
-                </wp:positionV>
-                <wp:extent cx="1439545" cy="719455"/>
-                <wp:effectExtent l="0" t="0" r="8255" b="4445"/>
-                <wp:wrapNone/>
-                <wp:docPr id="366849650" name="Rectangle 1"/>
-                <wp:cNvGraphicFramePr>
-                  <a:graphicFrameLocks xmlns:a="http://schemas.openxmlformats.org/drawingml/2006/main" noChangeAspect="1"/>
-                </wp:cNvGraphicFramePr>
-                <a:graphic xmlns:a="http://schemas.openxmlformats.org/drawingml/2006/main">
-                  <a:graphicData uri="http://schemas.microsoft.com/office/word/2010/wordprocessingShape">
-                    <wps:wsp>
-                      <wps:cNvSpPr>
-                        <a:spLocks noChangeAspect="1"/>
-                      </wps:cNvSpPr>
-                      <wps:spPr>
-                        <a:xfrm>
-                          <a:off x="0" y="0"/>
-                          <a:ext cx="1439545" cy="719455"/>
-                        </a:xfrm>
-                        <a:prstGeom prst="rect">
-                          <a:avLst/>
-                        </a:prstGeom>
-                        <a:solidFill>
-                          <a:srgbClr val="D9D9D9"/>
-                        </a:solidFill>
-                        <a:ln>
-                          <a:noFill/>
-                        </a:ln>
-                      </wps:spPr>
-                      <wps:style>
-                        <a:lnRef idx="2">
-                          <a:schemeClr val="accent1">
-                            <a:shade val="15000"/>
-                          </a:schemeClr>
-                        </a:lnRef>
-                        <a:fillRef idx="1">
-                          <a:schemeClr val="accent1"/>
-                        </a:fillRef>
-                        <a:effectRef idx="0">
-                          <a:schemeClr val="accent1"/>
-                        </a:effectRef>
-                        <a:fontRef idx="minor">
-                          <a:schemeClr val="lt1"/>
-                        </a:fontRef>
-                      </wps:style>
-                      <wps:bodyPr rot="0" spcFirstLastPara="0" vertOverflow="overflow" horzOverflow="overflow" vert="horz" wrap="square" lIns="91440" tIns="45720" rIns="91440" bIns="45720" numCol="1" spcCol="0" rtlCol="0" fromWordArt="0" anchor="ctr" anchorCtr="0" forceAA="0" compatLnSpc="1">
-                        <a:prstTxWarp prst="textNoShape">
-                          <a:avLst/>
-                        </a:prstTxWarp>
-                        <a:noAutofit/>
-                      </wps:bodyPr>
-                    </wps:wsp>
-                  </a:graphicData>
-                </a:graphic>
-                <wp14:sizeRelH relativeFrom="margin">
-                  <wp14:pctWidth>0</wp14:pctWidth>
-                </wp14:sizeRelH>
-                <wp14:sizeRelV relativeFrom="margin">
-                  <wp14:pctHeight>0</wp14:pctHeight>
-                </wp14:sizeRelV>
-              </wp:anchor>
-            </w:drawing>
-          </mc:Choice>
-          <mc:Fallback>
-            <w:pict>
-              <v:rect w14:anchorId="71A6B0C7" id="Rectangle 1" o:spid="_x0000_s1026" style="position:absolute;margin-left:89.3pt;margin-top:101.75pt;width:113.35pt;height:56.65pt;z-index:251663360;visibility:visible;mso-wrap-style:square;mso-width-percent:0;mso-height-percent:0;mso-wrap-distance-left:9pt;mso-wrap-distance-top:0;mso-wrap-distance-right:9pt;mso-wrap-distance-bottom:0;mso-position-horizontal:absolute;mso-position-horizontal-relative:text;mso-position-vertical:absolute;mso-position-vertical-relative:text;mso-width-percent:0;mso-height-percent:0;mso-width-relative:margin;mso-height-relative:margin;v-text-anchor:middle" o:gfxdata="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" fillcolor="#d9d9d9" stroked="f" strokeweight="1pt">
-                <o:lock v:ext="edit" aspectratio="t"/>
-              </v:rect>
-            </w:pict>
-          </mc:Fallback>
-        </mc:AlternateContent>
-      </w:r>
-      <w:r>
-        <w:rPr>
-          <w:noProof/>
-        </w:rPr>
-        <mc:AlternateContent>
-          <mc:Choice Requires="wps">
-            <w:drawing>
-              <wp:anchor distT="0" distB="0" distL="114300" distR="114300" simplePos="0" relativeHeight="251661312" behindDoc="0" locked="0" layoutInCell="1" allowOverlap="1" wp14:anchorId="219B03FC" wp14:editId="61B0786D">
-                <wp:simplePos x="0" y="0"/>
-                <wp:positionH relativeFrom="column">
-                  <wp:posOffset>2565651</wp:posOffset>
-                </wp:positionH>
-                <wp:positionV relativeFrom="paragraph">
-                  <wp:posOffset>1294238</wp:posOffset>
-                </wp:positionV>
-                <wp:extent cx="1440000" cy="720000"/>
-                <wp:effectExtent l="0" t="0" r="8255" b="4445"/>
-                <wp:wrapNone/>
-                <wp:docPr id="1893615764" name="Rectangle 1"/>
-                <wp:cNvGraphicFramePr>
-                  <a:graphicFrameLocks xmlns:a="http://schemas.openxmlformats.org/drawingml/2006/main" noChangeAspect="1"/>
-                </wp:cNvGraphicFramePr>
-                <a:graphic xmlns:a="http://schemas.openxmlformats.org/drawingml/2006/main">
-                  <a:graphicData uri="http://schemas.microsoft.com/office/word/2010/wordprocessingShape">
-                    <wps:wsp>
-                      <wps:cNvSpPr>
-                        <a:spLocks noChangeAspect="1"/>
-                      </wps:cNvSpPr>
-                      <wps:spPr>
-                        <a:xfrm>
-                          <a:off x="0" y="0"/>
-                          <a:ext cx="1440000" cy="720000"/>
-                        </a:xfrm>
-                        <a:prstGeom prst="rect">
-                          <a:avLst/>
-                        </a:prstGeom>
-                        <a:solidFill>
-                          <a:srgbClr val="F2F2F2"/>
-                        </a:solidFill>
-                        <a:ln>
-                          <a:noFill/>
-                        </a:ln>
-                      </wps:spPr>
-                      <wps:style>
-                        <a:lnRef idx="2">
-                          <a:schemeClr val="accent1">
-                            <a:shade val="15000"/>
-                          </a:schemeClr>
-                        </a:lnRef>
-                        <a:fillRef idx="1">
-                          <a:schemeClr val="accent1"/>
-                        </a:fillRef>
-                        <a:effectRef idx="0">
-                          <a:schemeClr val="accent1"/>
-                        </a:effectRef>
-                        <a:fontRef idx="minor">
-                          <a:schemeClr val="lt1"/>
-                        </a:fontRef>
-                      </wps:style>
-                      <wps:bodyPr rot="0" spcFirstLastPara="0" vertOverflow="overflow" horzOverflow="overflow" vert="horz" wrap="square" lIns="91440" tIns="45720" rIns="91440" bIns="45720" numCol="1" spcCol="0" rtlCol="0" fromWordArt="0" anchor="ctr" anchorCtr="0" forceAA="0" compatLnSpc="1">
-                        <a:prstTxWarp prst="textNoShape">
-                          <a:avLst/>
-                        </a:prstTxWarp>
-                        <a:noAutofit/>
-                      </wps:bodyPr>
-                    </wps:wsp>
-                  </a:graphicData>
-                </a:graphic>
-                <wp14:sizeRelH relativeFrom="margin">
-                  <wp14:pctWidth>0</wp14:pctWidth>
-                </wp14:sizeRelH>
-                <wp14:sizeRelV relativeFrom="margin">
-                  <wp14:pctHeight>0</wp14:pctHeight>
-                </wp14:sizeRelV>
-              </wp:anchor>
-            </w:drawing>
-          </mc:Choice>
-          <mc:Fallback>
-            <w:pict>
-              <v:rect w14:anchorId="4036EE0E" id="Rectangle 1" o:spid="_x0000_s1026" style="position:absolute;margin-left:202pt;margin-top:101.9pt;width:113.4pt;height:56.7pt;z-index:251661312;visibility:visible;mso-wrap-style:square;mso-width-percent:0;mso-height-percent:0;mso-wrap-distance-left:9pt;mso-wrap-distance-top:0;mso-wrap-distance-right:9pt;mso-wrap-distance-bottom:0;mso-position-horizontal:absolute;mso-position-horizontal-relative:text;mso-position-vertical:absolute;mso-position-vertical-relative:text;mso-width-percent:0;mso-height-percent:0;mso-width-relative:margin;mso-height-relative:margin;v-text-anchor:middle" o:gfxdata="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" fillcolor="#f2f2f2" stroked="f" strokeweight="1pt">
+              <v:rect w14:anchorId="7C1B9FBB" id="Rectangle 1" o:spid="_x0000_s1026" style="position:absolute;margin-left:196.15pt;margin-top:356pt;width:113.4pt;height:56.7pt;z-index:251671552;visibility:visible;mso-wrap-style:square;mso-width-percent:0;mso-height-percent:0;mso-wrap-distance-left:9pt;mso-wrap-distance-top:0;mso-wrap-distance-right:9pt;mso-wrap-distance-bottom:0;mso-position-horizontal:absolute;mso-position-horizontal-relative:text;mso-position-vertical:absolute;mso-position-vertical-relative:text;mso-width-percent:0;mso-height-percent:0;mso-width-relative:margin;mso-height-relative:margin;v-text-anchor:middle" o:gfxdata="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" fillcolor="#2dc9c4" stroked="f" strokeweight="1pt">
                 <o:lock v:ext="edit" aspectratio="t"/>
               </v:rect>
             </w:pict>

</xml_diff>